<commit_message>
Describe Power BI report and add dashboard screenshot
</commit_message>
<xml_diff>
--- a/steam_coursework_project/docs/CourseWork_Report_SteamLike.docx
+++ b/steam_coursework_project/docs/CourseWork_Report_SteamLike.docx
@@ -2171,7 +2171,7 @@
       </w:r>
     </w:p>
     <w:bookmarkEnd w:id="32"/>
-    <w:bookmarkStart w:id="33" w:name="power-bi-report"/>
+    <w:bookmarkStart w:id="36" w:name="power-bi-report"/>
     <w:p>
       <w:pPr>
         <w:pStyle w:val="Heading1"/>
@@ -2185,7 +2185,22 @@
         <w:pStyle w:val="FirstParagraph"/>
       </w:pPr>
       <w:r>
-        <w:t xml:space="preserve">The report connects to</w:t>
+        <w:t xml:space="preserve">The report</w:t>
+      </w:r>
+      <w:r>
+        <w:t xml:space="preserve"> </w:t>
+      </w:r>
+      <w:r>
+        <w:rPr>
+          <w:rStyle w:val="VerbatimChar"/>
+        </w:rPr>
+        <w:t xml:space="preserve">powerbi/Steam_OLAP_Dashboard.pbix</w:t>
+      </w:r>
+      <w:r>
+        <w:t xml:space="preserve"> </w:t>
+      </w:r>
+      <w:r>
+        <w:t xml:space="preserve">connects to</w:t>
       </w:r>
       <w:r>
         <w:t xml:space="preserve"> </w:t>
@@ -2200,7 +2215,7 @@
         <w:t xml:space="preserve"> </w:t>
       </w:r>
       <w:r>
-        <w:t xml:space="preserve">and imports the tables of schema</w:t>
+        <w:t xml:space="preserve">in Import mode and loads ten tables of schema</w:t>
       </w:r>
       <w:r>
         <w:t xml:space="preserve"> </w:t>
@@ -2212,7 +2227,22 @@
         <w:t xml:space="preserve">steam_dwh</w:t>
       </w:r>
       <w:r>
-        <w:t xml:space="preserve">. Import steps, relationships, DAX measures and the page layout are in</w:t>
+        <w:t xml:space="preserve">: two facts, the bridge and seven dimensions.</w:t>
+      </w:r>
+      <w:r>
+        <w:t xml:space="preserve"> </w:t>
+      </w:r>
+      <w:r>
+        <w:rPr>
+          <w:rStyle w:val="VerbatimChar"/>
+        </w:rPr>
+        <w:t xml:space="preserve">etl_rejects</w:t>
+      </w:r>
+      <w:r>
+        <w:t xml:space="preserve"> </w:t>
+      </w:r>
+      <w:r>
+        <w:t xml:space="preserve">and the staging schema stay out of the model. Build steps and the DAX code are in</w:t>
       </w:r>
       <w:r>
         <w:t xml:space="preserve"> </w:t>
@@ -2224,17 +2254,74 @@
         <w:t xml:space="preserve">powerbi/POWERBI_GUIDE.md</w:t>
       </w:r>
       <w:r>
-        <w:t xml:space="preserve">. The page has a title, three KPI cards, two slicers (year and month, country), a line chart of net revenue by month, a bar chart of net revenue by game, a donut chart of genre allocated revenue and a table with current price, units and revenue.</w:t>
-      </w:r>
-    </w:p>
-    <w:bookmarkEnd w:id="33"/>
-    <w:bookmarkStart w:id="34" w:name="defense-notes"/>
-    <w:p>
-      <w:pPr>
-        <w:pStyle w:val="Heading1"/>
-      </w:pPr>
-      <w:r>
-        <w:t xml:space="preserve">9. Defense notes</w:t>
+        <w:t xml:space="preserve">.</w:t>
+      </w:r>
+    </w:p>
+    <w:p>
+      <w:pPr>
+        <w:pStyle w:val="CaptionedFigure"/>
+      </w:pPr>
+      <w:r>
+        <w:drawing>
+          <wp:inline>
+            <wp:extent cx="5334000" cy="3235472"/>
+            <wp:effectExtent b="0" l="0" r="0" t="0"/>
+            <wp:docPr descr="Power BI page Sales Overview" title="" id="34" name="Picture"/>
+            <a:graphic>
+              <a:graphicData uri="http://schemas.openxmlformats.org/drawingml/2006/picture">
+                <pic:pic>
+                  <pic:nvPicPr>
+                    <pic:cNvPr descr="../diagrams/powerbi_dashboard.png" id="35" name="Picture"/>
+                    <pic:cNvPicPr>
+                      <a:picLocks noChangeArrowheads="1" noChangeAspect="1"/>
+                    </pic:cNvPicPr>
+                  </pic:nvPicPr>
+                  <pic:blipFill>
+                    <a:blip r:embed="rId33"/>
+                    <a:stretch>
+                      <a:fillRect/>
+                    </a:stretch>
+                  </pic:blipFill>
+                  <pic:spPr bwMode="auto">
+                    <a:xfrm>
+                      <a:off x="0" y="0"/>
+                      <a:ext cx="5334000" cy="3235472"/>
+                    </a:xfrm>
+                    <a:prstGeom prst="rect">
+                      <a:avLst/>
+                    </a:prstGeom>
+                    <a:noFill/>
+                    <a:ln w="9525">
+                      <a:noFill/>
+                      <a:headEnd/>
+                      <a:tailEnd/>
+                    </a:ln>
+                  </pic:spPr>
+                </pic:pic>
+              </a:graphicData>
+            </a:graphic>
+          </wp:inline>
+        </w:drawing>
+      </w:r>
+    </w:p>
+    <w:p>
+      <w:pPr>
+        <w:pStyle w:val="ImageCaption"/>
+      </w:pPr>
+      <w:r>
+        <w:t xml:space="preserve">Power BI page Sales Overview</w:t>
+      </w:r>
+    </w:p>
+    <w:p>
+      <w:pPr>
+        <w:pStyle w:val="BodyText"/>
+      </w:pPr>
+      <w:r>
+        <w:rPr>
+          <w:bCs/>
+          <w:b/>
+        </w:rPr>
+        <w:t xml:space="preserve">Transformations in Power Query</w:t>
       </w:r>
     </w:p>
     <w:p>
@@ -2246,7 +2333,70 @@
         <w:pStyle w:val="Compact"/>
       </w:pPr>
       <w:r>
-        <w:t xml:space="preserve">OLTP has 13 tables in 3NF. CSV files have no surrogate keys and number five.</w:t>
+        <w:rPr>
+          <w:rStyle w:val="VerbatimChar"/>
+        </w:rPr>
+        <w:t xml:space="preserve">fact_sales</w:t>
+      </w:r>
+      <w:r>
+        <w:t xml:space="preserve">:</w:t>
+      </w:r>
+      <w:r>
+        <w:t xml:space="preserve"> </w:t>
+      </w:r>
+      <w:r>
+        <w:rPr>
+          <w:rStyle w:val="VerbatimChar"/>
+        </w:rPr>
+        <w:t xml:space="preserve">gross_revenue</w:t>
+      </w:r>
+      <w:r>
+        <w:t xml:space="preserve">,</w:t>
+      </w:r>
+      <w:r>
+        <w:t xml:space="preserve"> </w:t>
+      </w:r>
+      <w:r>
+        <w:rPr>
+          <w:rStyle w:val="VerbatimChar"/>
+        </w:rPr>
+        <w:t xml:space="preserve">discount_amount</w:t>
+      </w:r>
+      <w:r>
+        <w:t xml:space="preserve"> </w:t>
+      </w:r>
+      <w:r>
+        <w:t xml:space="preserve">and</w:t>
+      </w:r>
+      <w:r>
+        <w:t xml:space="preserve"> </w:t>
+      </w:r>
+      <w:r>
+        <w:rPr>
+          <w:rStyle w:val="VerbatimChar"/>
+        </w:rPr>
+        <w:t xml:space="preserve">net_revenue</w:t>
+      </w:r>
+      <w:r>
+        <w:t xml:space="preserve"> </w:t>
+      </w:r>
+      <w:r>
+        <w:t xml:space="preserve">changed to fixed decimal number,</w:t>
+      </w:r>
+      <w:r>
+        <w:t xml:space="preserve"> </w:t>
+      </w:r>
+      <w:r>
+        <w:rPr>
+          <w:rStyle w:val="VerbatimChar"/>
+        </w:rPr>
+        <w:t xml:space="preserve">units_sold</w:t>
+      </w:r>
+      <w:r>
+        <w:t xml:space="preserve"> </w:t>
+      </w:r>
+      <w:r>
+        <w:t xml:space="preserve">to whole number.</w:t>
       </w:r>
     </w:p>
     <w:p>
@@ -2258,7 +2408,28 @@
         <w:pStyle w:val="Compact"/>
       </w:pPr>
       <w:r>
-        <w:t xml:space="preserve">Load and ETL scripts do not modify rows whose values did not change. A test run of both scripts left every row version in both databases identical.</w:t>
+        <w:rPr>
+          <w:rStyle w:val="VerbatimChar"/>
+        </w:rPr>
+        <w:t xml:space="preserve">dim_game</w:t>
+      </w:r>
+      <w:r>
+        <w:t xml:space="preserve">:</w:t>
+      </w:r>
+      <w:r>
+        <w:t xml:space="preserve"> </w:t>
+      </w:r>
+      <w:r>
+        <w:rPr>
+          <w:rStyle w:val="VerbatimChar"/>
+        </w:rPr>
+        <w:t xml:space="preserve">age_rating</w:t>
+      </w:r>
+      <w:r>
+        <w:t xml:space="preserve"> </w:t>
+      </w:r>
+      <w:r>
+        <w:t xml:space="preserve">changed to uppercase.</w:t>
       </w:r>
     </w:p>
     <w:p>
@@ -2270,7 +2441,28 @@
         <w:pStyle w:val="Compact"/>
       </w:pPr>
       <w:r>
-        <w:t xml:space="preserve">OLAP is a separate database, a snowflake with two facts, one SCD Type 2 and one bridge. One fact is an aggregation of three OLTP tables.</w:t>
+        <w:rPr>
+          <w:rStyle w:val="VerbatimChar"/>
+        </w:rPr>
+        <w:t xml:space="preserve">dim_date</w:t>
+      </w:r>
+      <w:r>
+        <w:t xml:space="preserve">: rows filtered to years 2025 and 2026,</w:t>
+      </w:r>
+      <w:r>
+        <w:t xml:space="preserve"> </w:t>
+      </w:r>
+      <w:r>
+        <w:rPr>
+          <w:rStyle w:val="VerbatimChar"/>
+        </w:rPr>
+        <w:t xml:space="preserve">full_date</w:t>
+      </w:r>
+      <w:r>
+        <w:t xml:space="preserve"> </w:t>
+      </w:r>
+      <w:r>
+        <w:t xml:space="preserve">typed as Date.</w:t>
       </w:r>
     </w:p>
     <w:p>
@@ -2282,16 +2474,43 @@
         <w:pStyle w:val="Compact"/>
       </w:pPr>
       <w:r>
-        <w:t xml:space="preserve">The SCD demo (</w:t>
-      </w:r>
-      <w:r>
-        <w:rPr>
-          <w:rStyle w:val="VerbatimChar"/>
-        </w:rPr>
-        <w:t xml:space="preserve">07_demo_scd2.sql</w:t>
-      </w:r>
-      <w:r>
-        <w:t xml:space="preserve">) changes the price of Hades in OLTP. The ETL closes the version valid until 2026-06-30 and adds a current version at 19.99.</w:t>
+        <w:rPr>
+          <w:rStyle w:val="VerbatimChar"/>
+        </w:rPr>
+        <w:t xml:space="preserve">dim_game_price_scd</w:t>
+      </w:r>
+      <w:r>
+        <w:t xml:space="preserve">:</w:t>
+      </w:r>
+      <w:r>
+        <w:t xml:space="preserve"> </w:t>
+      </w:r>
+      <w:r>
+        <w:rPr>
+          <w:rStyle w:val="VerbatimChar"/>
+        </w:rPr>
+        <w:t xml:space="preserve">valid_from</w:t>
+      </w:r>
+      <w:r>
+        <w:t xml:space="preserve"> </w:t>
+      </w:r>
+      <w:r>
+        <w:t xml:space="preserve">and</w:t>
+      </w:r>
+      <w:r>
+        <w:t xml:space="preserve"> </w:t>
+      </w:r>
+      <w:r>
+        <w:rPr>
+          <w:rStyle w:val="VerbatimChar"/>
+        </w:rPr>
+        <w:t xml:space="preserve">valid_to</w:t>
+      </w:r>
+      <w:r>
+        <w:t xml:space="preserve"> </w:t>
+      </w:r>
+      <w:r>
+        <w:t xml:space="preserve">typed as Date.</w:t>
       </w:r>
     </w:p>
     <w:p>
@@ -2303,6 +2522,816 @@
         <w:pStyle w:val="Compact"/>
       </w:pPr>
       <w:r>
+        <w:t xml:space="preserve">Tables renamed without the schema prefix,</w:t>
+      </w:r>
+      <w:r>
+        <w:t xml:space="preserve"> </w:t>
+      </w:r>
+      <w:r>
+        <w:rPr>
+          <w:rStyle w:val="VerbatimChar"/>
+        </w:rPr>
+        <w:t xml:space="preserve">month_name</w:t>
+      </w:r>
+      <w:r>
+        <w:t xml:space="preserve"> </w:t>
+      </w:r>
+      <w:r>
+        <w:t xml:space="preserve">sorted by</w:t>
+      </w:r>
+      <w:r>
+        <w:t xml:space="preserve"> </w:t>
+      </w:r>
+      <w:r>
+        <w:rPr>
+          <w:rStyle w:val="VerbatimChar"/>
+        </w:rPr>
+        <w:t xml:space="preserve">month</w:t>
+      </w:r>
+      <w:r>
+        <w:t xml:space="preserve">.</w:t>
+      </w:r>
+    </w:p>
+    <w:p>
+      <w:pPr>
+        <w:pStyle w:val="FirstParagraph"/>
+      </w:pPr>
+      <w:r>
+        <w:rPr>
+          <w:bCs/>
+          <w:b/>
+        </w:rPr>
+        <w:t xml:space="preserve">Model</w:t>
+      </w:r>
+    </w:p>
+    <w:p>
+      <w:pPr>
+        <w:pStyle w:val="BodyText"/>
+      </w:pPr>
+      <w:r>
+        <w:t xml:space="preserve">Relationships run many-to-one from the facts to the dimensions, with single-direction filters.</w:t>
+      </w:r>
+      <w:r>
+        <w:t xml:space="preserve"> </w:t>
+      </w:r>
+      <w:r>
+        <w:rPr>
+          <w:rStyle w:val="VerbatimChar"/>
+        </w:rPr>
+        <w:t xml:space="preserve">dim_user</w:t>
+      </w:r>
+      <w:r>
+        <w:t xml:space="preserve"> </w:t>
+      </w:r>
+      <w:r>
+        <w:t xml:space="preserve">points to</w:t>
+      </w:r>
+      <w:r>
+        <w:t xml:space="preserve"> </w:t>
+      </w:r>
+      <w:r>
+        <w:rPr>
+          <w:rStyle w:val="VerbatimChar"/>
+        </w:rPr>
+        <w:t xml:space="preserve">dim_country</w:t>
+      </w:r>
+      <w:r>
+        <w:t xml:space="preserve">, so the country slicer filters both facts. The relationship from</w:t>
+      </w:r>
+      <w:r>
+        <w:t xml:space="preserve"> </w:t>
+      </w:r>
+      <w:r>
+        <w:rPr>
+          <w:rStyle w:val="VerbatimChar"/>
+        </w:rPr>
+        <w:t xml:space="preserve">dim_game_price_scd</w:t>
+      </w:r>
+      <w:r>
+        <w:t xml:space="preserve"> </w:t>
+      </w:r>
+      <w:r>
+        <w:t xml:space="preserve">to</w:t>
+      </w:r>
+      <w:r>
+        <w:t xml:space="preserve"> </w:t>
+      </w:r>
+      <w:r>
+        <w:rPr>
+          <w:rStyle w:val="VerbatimChar"/>
+        </w:rPr>
+        <w:t xml:space="preserve">dim_game</w:t>
+      </w:r>
+      <w:r>
+        <w:t xml:space="preserve"> </w:t>
+      </w:r>
+      <w:r>
+        <w:t xml:space="preserve">stays inactive, because an active one would open a second path from</w:t>
+      </w:r>
+      <w:r>
+        <w:t xml:space="preserve"> </w:t>
+      </w:r>
+      <w:r>
+        <w:rPr>
+          <w:rStyle w:val="VerbatimChar"/>
+        </w:rPr>
+        <w:t xml:space="preserve">dim_game</w:t>
+      </w:r>
+      <w:r>
+        <w:t xml:space="preserve"> </w:t>
+      </w:r>
+      <w:r>
+        <w:t xml:space="preserve">to</w:t>
+      </w:r>
+      <w:r>
+        <w:t xml:space="preserve"> </w:t>
+      </w:r>
+      <w:r>
+        <w:rPr>
+          <w:rStyle w:val="VerbatimChar"/>
+        </w:rPr>
+        <w:t xml:space="preserve">fact_sales</w:t>
+      </w:r>
+      <w:r>
+        <w:t xml:space="preserve">. The measure Current Price switches it on with</w:t>
+      </w:r>
+      <w:r>
+        <w:t xml:space="preserve"> </w:t>
+      </w:r>
+      <w:r>
+        <w:rPr>
+          <w:rStyle w:val="VerbatimChar"/>
+        </w:rPr>
+        <w:t xml:space="preserve">USERELATIONSHIP</w:t>
+      </w:r>
+      <w:r>
+        <w:t xml:space="preserve">.</w:t>
+      </w:r>
+    </w:p>
+    <w:p>
+      <w:pPr>
+        <w:pStyle w:val="BodyText"/>
+      </w:pPr>
+      <w:r>
+        <w:rPr>
+          <w:bCs/>
+          <w:b/>
+        </w:rPr>
+        <w:t xml:space="preserve">Measures</w:t>
+      </w:r>
+    </w:p>
+    <w:p>
+      <w:pPr>
+        <w:numPr>
+          <w:ilvl w:val="0"/>
+          <w:numId w:val="1004"/>
+        </w:numPr>
+        <w:pStyle w:val="Compact"/>
+      </w:pPr>
+      <w:r>
+        <w:t xml:space="preserve">Net Revenue, Gross Revenue, Units Sold: sums over</w:t>
+      </w:r>
+      <w:r>
+        <w:t xml:space="preserve"> </w:t>
+      </w:r>
+      <w:r>
+        <w:rPr>
+          <w:rStyle w:val="VerbatimChar"/>
+        </w:rPr>
+        <w:t xml:space="preserve">fact_sales</w:t>
+      </w:r>
+      <w:r>
+        <w:t xml:space="preserve">.</w:t>
+      </w:r>
+    </w:p>
+    <w:p>
+      <w:pPr>
+        <w:numPr>
+          <w:ilvl w:val="0"/>
+          <w:numId w:val="1004"/>
+        </w:numPr>
+        <w:pStyle w:val="Compact"/>
+      </w:pPr>
+      <w:r>
+        <w:t xml:space="preserve">Discount Share: discount amount divided by gross revenue.</w:t>
+      </w:r>
+    </w:p>
+    <w:p>
+      <w:pPr>
+        <w:numPr>
+          <w:ilvl w:val="0"/>
+          <w:numId w:val="1004"/>
+        </w:numPr>
+        <w:pStyle w:val="Compact"/>
+      </w:pPr>
+      <w:r>
+        <w:t xml:space="preserve">Avg Rating: average review rating weighted by the number of reviews.</w:t>
+      </w:r>
+    </w:p>
+    <w:p>
+      <w:pPr>
+        <w:numPr>
+          <w:ilvl w:val="0"/>
+          <w:numId w:val="1004"/>
+        </w:numPr>
+        <w:pStyle w:val="Compact"/>
+      </w:pPr>
+      <w:r>
+        <w:t xml:space="preserve">Current Price: price of the SCD Type 2 version with</w:t>
+      </w:r>
+      <w:r>
+        <w:t xml:space="preserve"> </w:t>
+      </w:r>
+      <w:r>
+        <w:rPr>
+          <w:rStyle w:val="VerbatimChar"/>
+        </w:rPr>
+        <w:t xml:space="preserve">is_current = TRUE</w:t>
+      </w:r>
+      <w:r>
+        <w:t xml:space="preserve">.</w:t>
+      </w:r>
+    </w:p>
+    <w:p>
+      <w:pPr>
+        <w:numPr>
+          <w:ilvl w:val="0"/>
+          <w:numId w:val="1004"/>
+        </w:numPr>
+        <w:pStyle w:val="Compact"/>
+      </w:pPr>
+      <w:r>
+        <w:t xml:space="preserve">Allocated Revenue by Genre: net revenue of each game multiplied by its bridge weight, so genre values add up to total revenue.</w:t>
+      </w:r>
+    </w:p>
+    <w:p>
+      <w:pPr>
+        <w:pStyle w:val="FirstParagraph"/>
+      </w:pPr>
+      <w:r>
+        <w:rPr>
+          <w:bCs/>
+          <w:b/>
+        </w:rPr>
+        <w:t xml:space="preserve">Page layout</w:t>
+      </w:r>
+    </w:p>
+    <w:tbl>
+      <w:tblPr>
+        <w:tblStyle w:val="Table"/>
+        <w:tblW w:type="pct" w:w="5000"/>
+        <w:tblLook w:firstRow="1" w:lastRow="0" w:firstColumn="0" w:lastColumn="0" w:noHBand="0" w:noVBand="0" w:val="0020"/>
+        <w:jc w:val="start"/>
+      </w:tblPr>
+      <w:tblGrid>
+        <w:gridCol w:w="2640"/>
+        <w:gridCol w:w="2640"/>
+        <w:gridCol w:w="2640"/>
+      </w:tblGrid>
+      <w:tr>
+        <w:trPr>
+          <w:tblHeader w:val="true"/>
+        </w:trPr>
+        <w:tc>
+          <w:tcPr/>
+          <w:p>
+            <w:pPr>
+              <w:pStyle w:val="Compact"/>
+              <w:jc w:val="left"/>
+            </w:pPr>
+            <w:r>
+              <w:t xml:space="preserve">Element</w:t>
+            </w:r>
+          </w:p>
+        </w:tc>
+        <w:tc>
+          <w:tcPr/>
+          <w:p>
+            <w:pPr>
+              <w:pStyle w:val="Compact"/>
+              <w:jc w:val="left"/>
+            </w:pPr>
+            <w:r>
+              <w:t xml:space="preserve">Fields</w:t>
+            </w:r>
+          </w:p>
+        </w:tc>
+        <w:tc>
+          <w:tcPr/>
+          <w:p>
+            <w:pPr>
+              <w:pStyle w:val="Compact"/>
+              <w:jc w:val="left"/>
+            </w:pPr>
+            <w:r>
+              <w:t xml:space="preserve">Question it answers</w:t>
+            </w:r>
+          </w:p>
+        </w:tc>
+      </w:tr>
+      <w:tr>
+        <w:tc>
+          <w:tcPr/>
+          <w:p>
+            <w:pPr>
+              <w:pStyle w:val="Compact"/>
+              <w:jc w:val="left"/>
+            </w:pPr>
+            <w:r>
+              <w:t xml:space="preserve">Title</w:t>
+            </w:r>
+          </w:p>
+        </w:tc>
+        <w:tc>
+          <w:tcPr/>
+          <w:p>
+            <w:pPr>
+              <w:pStyle w:val="Compact"/>
+              <w:jc w:val="left"/>
+            </w:pPr>
+            <w:r>
+              <w:t xml:space="preserve">Steam-like Platform Sales Dashboard</w:t>
+            </w:r>
+          </w:p>
+        </w:tc>
+        <w:tc>
+          <w:tcPr/>
+          <w:p>
+            <w:pPr>
+              <w:pStyle w:val="Compact"/>
+            </w:pPr>
+          </w:p>
+        </w:tc>
+      </w:tr>
+      <w:tr>
+        <w:tc>
+          <w:tcPr/>
+          <w:p>
+            <w:pPr>
+              <w:pStyle w:val="Compact"/>
+              <w:jc w:val="left"/>
+            </w:pPr>
+            <w:r>
+              <w:t xml:space="preserve">Three cards</w:t>
+            </w:r>
+          </w:p>
+        </w:tc>
+        <w:tc>
+          <w:tcPr/>
+          <w:p>
+            <w:pPr>
+              <w:pStyle w:val="Compact"/>
+              <w:jc w:val="left"/>
+            </w:pPr>
+            <w:r>
+              <w:t xml:space="preserve">Net Revenue, Units Sold, Avg Rating</w:t>
+            </w:r>
+          </w:p>
+        </w:tc>
+        <w:tc>
+          <w:tcPr/>
+          <w:p>
+            <w:pPr>
+              <w:pStyle w:val="Compact"/>
+              <w:jc w:val="left"/>
+            </w:pPr>
+            <w:r>
+              <w:t xml:space="preserve">What are the totals for the selected period and country?</w:t>
+            </w:r>
+          </w:p>
+        </w:tc>
+      </w:tr>
+      <w:tr>
+        <w:tc>
+          <w:tcPr/>
+          <w:p>
+            <w:pPr>
+              <w:pStyle w:val="Compact"/>
+              <w:jc w:val="left"/>
+            </w:pPr>
+            <w:r>
+              <w:t xml:space="preserve">Slicer (dropdown)</w:t>
+            </w:r>
+          </w:p>
+        </w:tc>
+        <w:tc>
+          <w:tcPr/>
+          <w:p>
+            <w:pPr>
+              <w:pStyle w:val="Compact"/>
+              <w:jc w:val="left"/>
+            </w:pPr>
+            <w:r>
+              <w:rPr>
+                <w:rStyle w:val="VerbatimChar"/>
+              </w:rPr>
+              <w:t xml:space="preserve">dim_date[year]</w:t>
+            </w:r>
+            <w:r>
+              <w:t xml:space="preserve">,</w:t>
+            </w:r>
+            <w:r>
+              <w:t xml:space="preserve"> </w:t>
+            </w:r>
+            <w:r>
+              <w:rPr>
+                <w:rStyle w:val="VerbatimChar"/>
+              </w:rPr>
+              <w:t xml:space="preserve">dim_date[month_name]</w:t>
+            </w:r>
+          </w:p>
+        </w:tc>
+        <w:tc>
+          <w:tcPr/>
+          <w:p>
+            <w:pPr>
+              <w:pStyle w:val="Compact"/>
+              <w:jc w:val="left"/>
+            </w:pPr>
+            <w:r>
+              <w:t xml:space="preserve">Narrows every visual to a year or month</w:t>
+            </w:r>
+          </w:p>
+        </w:tc>
+      </w:tr>
+      <w:tr>
+        <w:tc>
+          <w:tcPr/>
+          <w:p>
+            <w:pPr>
+              <w:pStyle w:val="Compact"/>
+              <w:jc w:val="left"/>
+            </w:pPr>
+            <w:r>
+              <w:t xml:space="preserve">Slicer (list)</w:t>
+            </w:r>
+          </w:p>
+        </w:tc>
+        <w:tc>
+          <w:tcPr/>
+          <w:p>
+            <w:pPr>
+              <w:pStyle w:val="Compact"/>
+              <w:jc w:val="left"/>
+            </w:pPr>
+            <w:r>
+              <w:rPr>
+                <w:rStyle w:val="VerbatimChar"/>
+              </w:rPr>
+              <w:t xml:space="preserve">dim_country[country_name]</w:t>
+            </w:r>
+          </w:p>
+        </w:tc>
+        <w:tc>
+          <w:tcPr/>
+          <w:p>
+            <w:pPr>
+              <w:pStyle w:val="Compact"/>
+              <w:jc w:val="left"/>
+            </w:pPr>
+            <w:r>
+              <w:t xml:space="preserve">Narrows every visual to one or more countries</w:t>
+            </w:r>
+          </w:p>
+        </w:tc>
+      </w:tr>
+      <w:tr>
+        <w:tc>
+          <w:tcPr/>
+          <w:p>
+            <w:pPr>
+              <w:pStyle w:val="Compact"/>
+              <w:jc w:val="left"/>
+            </w:pPr>
+            <w:r>
+              <w:t xml:space="preserve">Line chart</w:t>
+            </w:r>
+          </w:p>
+        </w:tc>
+        <w:tc>
+          <w:tcPr/>
+          <w:p>
+            <w:pPr>
+              <w:pStyle w:val="Compact"/>
+              <w:jc w:val="left"/>
+            </w:pPr>
+            <w:r>
+              <w:rPr>
+                <w:rStyle w:val="VerbatimChar"/>
+              </w:rPr>
+              <w:t xml:space="preserve">dim_date[year_month]</w:t>
+            </w:r>
+            <w:r>
+              <w:t xml:space="preserve">, Net Revenue</w:t>
+            </w:r>
+          </w:p>
+        </w:tc>
+        <w:tc>
+          <w:tcPr/>
+          <w:p>
+            <w:pPr>
+              <w:pStyle w:val="Compact"/>
+              <w:jc w:val="left"/>
+            </w:pPr>
+            <w:r>
+              <w:t xml:space="preserve">Which months earned the most?</w:t>
+            </w:r>
+          </w:p>
+        </w:tc>
+      </w:tr>
+      <w:tr>
+        <w:tc>
+          <w:tcPr/>
+          <w:p>
+            <w:pPr>
+              <w:pStyle w:val="Compact"/>
+              <w:jc w:val="left"/>
+            </w:pPr>
+            <w:r>
+              <w:t xml:space="preserve">Bar chart</w:t>
+            </w:r>
+          </w:p>
+        </w:tc>
+        <w:tc>
+          <w:tcPr/>
+          <w:p>
+            <w:pPr>
+              <w:pStyle w:val="Compact"/>
+              <w:jc w:val="left"/>
+            </w:pPr>
+            <w:r>
+              <w:rPr>
+                <w:rStyle w:val="VerbatimChar"/>
+              </w:rPr>
+              <w:t xml:space="preserve">dim_game[title]</w:t>
+            </w:r>
+            <w:r>
+              <w:t xml:space="preserve">, Net Revenue</w:t>
+            </w:r>
+          </w:p>
+        </w:tc>
+        <w:tc>
+          <w:tcPr/>
+          <w:p>
+            <w:pPr>
+              <w:pStyle w:val="Compact"/>
+              <w:jc w:val="left"/>
+            </w:pPr>
+            <w:r>
+              <w:t xml:space="preserve">Which games bring the most revenue?</w:t>
+            </w:r>
+          </w:p>
+        </w:tc>
+      </w:tr>
+      <w:tr>
+        <w:tc>
+          <w:tcPr/>
+          <w:p>
+            <w:pPr>
+              <w:pStyle w:val="Compact"/>
+              <w:jc w:val="left"/>
+            </w:pPr>
+            <w:r>
+              <w:t xml:space="preserve">Pie chart</w:t>
+            </w:r>
+          </w:p>
+        </w:tc>
+        <w:tc>
+          <w:tcPr/>
+          <w:p>
+            <w:pPr>
+              <w:pStyle w:val="Compact"/>
+              <w:jc w:val="left"/>
+            </w:pPr>
+            <w:r>
+              <w:rPr>
+                <w:rStyle w:val="VerbatimChar"/>
+              </w:rPr>
+              <w:t xml:space="preserve">dim_genre[genre_name]</w:t>
+            </w:r>
+            <w:r>
+              <w:t xml:space="preserve">, Allocated Revenue by Genre</w:t>
+            </w:r>
+          </w:p>
+        </w:tc>
+        <w:tc>
+          <w:tcPr/>
+          <w:p>
+            <w:pPr>
+              <w:pStyle w:val="Compact"/>
+              <w:jc w:val="left"/>
+            </w:pPr>
+            <w:r>
+              <w:t xml:space="preserve">Which genres bring the most revenue?</w:t>
+            </w:r>
+          </w:p>
+        </w:tc>
+      </w:tr>
+      <w:tr>
+        <w:tc>
+          <w:tcPr/>
+          <w:p>
+            <w:pPr>
+              <w:pStyle w:val="Compact"/>
+              <w:jc w:val="left"/>
+            </w:pPr>
+            <w:r>
+              <w:t xml:space="preserve">Table</w:t>
+            </w:r>
+          </w:p>
+        </w:tc>
+        <w:tc>
+          <w:tcPr/>
+          <w:p>
+            <w:pPr>
+              <w:pStyle w:val="Compact"/>
+              <w:jc w:val="left"/>
+            </w:pPr>
+            <w:r>
+              <w:rPr>
+                <w:rStyle w:val="VerbatimChar"/>
+              </w:rPr>
+              <w:t xml:space="preserve">dim_game[title]</w:t>
+            </w:r>
+            <w:r>
+              <w:t xml:space="preserve">, Current Price, Units Sold, Net Revenue</w:t>
+            </w:r>
+          </w:p>
+        </w:tc>
+        <w:tc>
+          <w:tcPr/>
+          <w:p>
+            <w:pPr>
+              <w:pStyle w:val="Compact"/>
+              <w:jc w:val="left"/>
+            </w:pPr>
+            <w:r>
+              <w:t xml:space="preserve">How does the current price compare with past sales?</w:t>
+            </w:r>
+          </w:p>
+        </w:tc>
+      </w:tr>
+    </w:tbl>
+    <w:p>
+      <w:pPr>
+        <w:pStyle w:val="BodyText"/>
+      </w:pPr>
+      <w:r>
+        <w:rPr>
+          <w:bCs/>
+          <w:b/>
+        </w:rPr>
+        <w:t xml:space="preserve">Findings with no slicer selected</w:t>
+      </w:r>
+    </w:p>
+    <w:p>
+      <w:pPr>
+        <w:numPr>
+          <w:ilvl w:val="0"/>
+          <w:numId w:val="1005"/>
+        </w:numPr>
+        <w:pStyle w:val="Compact"/>
+      </w:pPr>
+      <w:r>
+        <w:t xml:space="preserve">Net revenue is EUR 2,953.24 from 165 purchases. Both numbers match the SQL control totals of the ETL.</w:t>
+      </w:r>
+    </w:p>
+    <w:p>
+      <w:pPr>
+        <w:numPr>
+          <w:ilvl w:val="0"/>
+          <w:numId w:val="1005"/>
+        </w:numPr>
+        <w:pStyle w:val="Compact"/>
+      </w:pPr>
+      <w:r>
+        <w:t xml:space="preserve">Sales run from May 2025 to May 2026. May 2026 is the best month with EUR 506.97, November 2025 the second with EUR 437.33.</w:t>
+      </w:r>
+    </w:p>
+    <w:p>
+      <w:pPr>
+        <w:numPr>
+          <w:ilvl w:val="0"/>
+          <w:numId w:val="1005"/>
+        </w:numPr>
+        <w:pStyle w:val="Compact"/>
+      </w:pPr>
+      <w:r>
+        <w:t xml:space="preserve">Baldur’s Gate 3 earns the most (EUR 739.68). Portal 2 sells the most copies (25).</w:t>
+      </w:r>
+    </w:p>
+    <w:p>
+      <w:pPr>
+        <w:numPr>
+          <w:ilvl w:val="0"/>
+          <w:numId w:val="1005"/>
+        </w:numPr>
+        <w:pStyle w:val="Compact"/>
+      </w:pPr>
+      <w:r>
+        <w:t xml:space="preserve">Adventure leads the genres with EUR 888.55 (30.09%), RPG follows with EUR 475.42.</w:t>
+      </w:r>
+    </w:p>
+    <w:p>
+      <w:pPr>
+        <w:numPr>
+          <w:ilvl w:val="0"/>
+          <w:numId w:val="1005"/>
+        </w:numPr>
+        <w:pStyle w:val="Compact"/>
+      </w:pPr>
+      <w:r>
+        <w:t xml:space="preserve">Counter-Strike 2 and Dota 2 account for 31 purchases at EUR 0: free games added to a library.</w:t>
+      </w:r>
+    </w:p>
+    <w:p>
+      <w:pPr>
+        <w:numPr>
+          <w:ilvl w:val="0"/>
+          <w:numId w:val="1005"/>
+        </w:numPr>
+        <w:pStyle w:val="Compact"/>
+      </w:pPr>
+      <w:r>
+        <w:t xml:space="preserve">The average review rating is 3.01 out of 5.</w:t>
+      </w:r>
+    </w:p>
+    <w:bookmarkEnd w:id="36"/>
+    <w:bookmarkStart w:id="37" w:name="defense-notes"/>
+    <w:p>
+      <w:pPr>
+        <w:pStyle w:val="Heading1"/>
+      </w:pPr>
+      <w:r>
+        <w:t xml:space="preserve">9. Defense notes</w:t>
+      </w:r>
+    </w:p>
+    <w:p>
+      <w:pPr>
+        <w:numPr>
+          <w:ilvl w:val="0"/>
+          <w:numId w:val="1006"/>
+        </w:numPr>
+        <w:pStyle w:val="Compact"/>
+      </w:pPr>
+      <w:r>
+        <w:t xml:space="preserve">OLTP has 13 tables in 3NF. CSV files have no surrogate keys and number five.</w:t>
+      </w:r>
+    </w:p>
+    <w:p>
+      <w:pPr>
+        <w:numPr>
+          <w:ilvl w:val="0"/>
+          <w:numId w:val="1006"/>
+        </w:numPr>
+        <w:pStyle w:val="Compact"/>
+      </w:pPr>
+      <w:r>
+        <w:t xml:space="preserve">Load and ETL scripts do not modify rows whose values did not change. A test run of both scripts left every row version in both databases identical.</w:t>
+      </w:r>
+    </w:p>
+    <w:p>
+      <w:pPr>
+        <w:numPr>
+          <w:ilvl w:val="0"/>
+          <w:numId w:val="1006"/>
+        </w:numPr>
+        <w:pStyle w:val="Compact"/>
+      </w:pPr>
+      <w:r>
+        <w:t xml:space="preserve">OLAP is a separate database, a snowflake with two facts, one SCD Type 2 and one bridge. One fact is an aggregation of three OLTP tables.</w:t>
+      </w:r>
+    </w:p>
+    <w:p>
+      <w:pPr>
+        <w:numPr>
+          <w:ilvl w:val="0"/>
+          <w:numId w:val="1006"/>
+        </w:numPr>
+        <w:pStyle w:val="Compact"/>
+      </w:pPr>
+      <w:r>
+        <w:t xml:space="preserve">The SCD demo (</w:t>
+      </w:r>
+      <w:r>
+        <w:rPr>
+          <w:rStyle w:val="VerbatimChar"/>
+        </w:rPr>
+        <w:t xml:space="preserve">07_demo_scd2.sql</w:t>
+      </w:r>
+      <w:r>
+        <w:t xml:space="preserve">) changes the price of Hades in OLTP. The ETL closes the version valid until 2026-06-30 and adds a current version at 19.99.</w:t>
+      </w:r>
+    </w:p>
+    <w:p>
+      <w:pPr>
+        <w:numPr>
+          <w:ilvl w:val="0"/>
+          <w:numId w:val="1006"/>
+        </w:numPr>
+        <w:pStyle w:val="Compact"/>
+      </w:pPr>
+      <w:r>
         <w:t xml:space="preserve">The ETL validates data and keeps refused records with a reason in</w:t>
       </w:r>
       <w:r>
@@ -2318,7 +3347,7 @@
         <w:t xml:space="preserve">.</w:t>
       </w:r>
     </w:p>
-    <w:bookmarkEnd w:id="34"/>
+    <w:bookmarkEnd w:id="37"/>
     <w:sectPr/>
   </w:body>
 </w:document>
@@ -2652,6 +3681,15 @@
   <w:num w:numId="1003">
     <w:abstractNumId w:val="991"/>
   </w:num>
+  <w:num w:numId="1004">
+    <w:abstractNumId w:val="991"/>
+  </w:num>
+  <w:num w:numId="1005">
+    <w:abstractNumId w:val="991"/>
+  </w:num>
+  <w:num w:numId="1006">
+    <w:abstractNumId w:val="991"/>
+  </w:num>
 </w:numbering>
 </file>
 
@@ -3141,7 +4179,7 @@
       <w:color w:themeColor="accent1" w:themeShade="BF" w:val="365F91"/>
     </w:rPr>
   </w:style>
-  <w:style w:type="paragraph" w:customStyle="1" w:styleId="SourceCode">
+  <w:style w:customStyle="1" w:styleId="SourceCode" w:type="paragraph">
     <w:name w:val="Source Code"/>
     <w:basedOn w:val="Normal"/>
     <w:link w:val="VerbatimChar"/>
@@ -3149,7 +4187,7 @@
       <w:wordWrap w:val="off"/>
     </w:pPr>
   </w:style>
-  <w:style w:type="character" w:customStyle="1" w:styleId="KeywordTok">
+  <w:style w:customStyle="1" w:styleId="KeywordTok" w:type="character">
     <w:name w:val="KeywordTok"/>
     <w:basedOn w:val="VerbatimChar"/>
     <w:rPr>
@@ -3157,77 +4195,77 @@
       <w:b/>
     </w:rPr>
   </w:style>
-  <w:style w:type="character" w:customStyle="1" w:styleId="DataTypeTok">
+  <w:style w:customStyle="1" w:styleId="DataTypeTok" w:type="character">
     <w:name w:val="DataTypeTok"/>
     <w:basedOn w:val="VerbatimChar"/>
     <w:rPr>
       <w:color w:val="902000"/>
     </w:rPr>
   </w:style>
-  <w:style w:type="character" w:customStyle="1" w:styleId="DecValTok">
+  <w:style w:customStyle="1" w:styleId="DecValTok" w:type="character">
     <w:name w:val="DecValTok"/>
     <w:basedOn w:val="VerbatimChar"/>
     <w:rPr>
       <w:color w:val="40a070"/>
     </w:rPr>
   </w:style>
-  <w:style w:type="character" w:customStyle="1" w:styleId="BaseNTok">
+  <w:style w:customStyle="1" w:styleId="BaseNTok" w:type="character">
     <w:name w:val="BaseNTok"/>
     <w:basedOn w:val="VerbatimChar"/>
     <w:rPr>
       <w:color w:val="40a070"/>
     </w:rPr>
   </w:style>
-  <w:style w:type="character" w:customStyle="1" w:styleId="FloatTok">
+  <w:style w:customStyle="1" w:styleId="FloatTok" w:type="character">
     <w:name w:val="FloatTok"/>
     <w:basedOn w:val="VerbatimChar"/>
     <w:rPr>
       <w:color w:val="40a070"/>
     </w:rPr>
   </w:style>
-  <w:style w:type="character" w:customStyle="1" w:styleId="ConstantTok">
+  <w:style w:customStyle="1" w:styleId="ConstantTok" w:type="character">
     <w:name w:val="ConstantTok"/>
     <w:basedOn w:val="VerbatimChar"/>
     <w:rPr>
       <w:color w:val="880000"/>
     </w:rPr>
   </w:style>
-  <w:style w:type="character" w:customStyle="1" w:styleId="CharTok">
+  <w:style w:customStyle="1" w:styleId="CharTok" w:type="character">
     <w:name w:val="CharTok"/>
     <w:basedOn w:val="VerbatimChar"/>
     <w:rPr>
       <w:color w:val="4070a0"/>
     </w:rPr>
   </w:style>
-  <w:style w:type="character" w:customStyle="1" w:styleId="SpecialCharTok">
+  <w:style w:customStyle="1" w:styleId="SpecialCharTok" w:type="character">
     <w:name w:val="SpecialCharTok"/>
     <w:basedOn w:val="VerbatimChar"/>
     <w:rPr>
       <w:color w:val="4070a0"/>
     </w:rPr>
   </w:style>
-  <w:style w:type="character" w:customStyle="1" w:styleId="StringTok">
+  <w:style w:customStyle="1" w:styleId="StringTok" w:type="character">
     <w:name w:val="StringTok"/>
     <w:basedOn w:val="VerbatimChar"/>
     <w:rPr>
       <w:color w:val="4070a0"/>
     </w:rPr>
   </w:style>
-  <w:style w:type="character" w:customStyle="1" w:styleId="VerbatimStringTok">
+  <w:style w:customStyle="1" w:styleId="VerbatimStringTok" w:type="character">
     <w:name w:val="VerbatimStringTok"/>
     <w:basedOn w:val="VerbatimChar"/>
     <w:rPr>
       <w:color w:val="4070a0"/>
     </w:rPr>
   </w:style>
-  <w:style w:type="character" w:customStyle="1" w:styleId="SpecialStringTok">
+  <w:style w:customStyle="1" w:styleId="SpecialStringTok" w:type="character">
     <w:name w:val="SpecialStringTok"/>
     <w:basedOn w:val="VerbatimChar"/>
     <w:rPr>
       <w:color w:val="bb6688"/>
     </w:rPr>
   </w:style>
-  <w:style w:type="character" w:customStyle="1" w:styleId="ImportTok">
+  <w:style w:customStyle="1" w:styleId="ImportTok" w:type="character">
     <w:name w:val="ImportTok"/>
     <w:basedOn w:val="VerbatimChar"/>
     <w:rPr>
@@ -3235,7 +4273,7 @@
       <w:b/>
     </w:rPr>
   </w:style>
-  <w:style w:type="character" w:customStyle="1" w:styleId="CommentTok">
+  <w:style w:customStyle="1" w:styleId="CommentTok" w:type="character">
     <w:name w:val="CommentTok"/>
     <w:basedOn w:val="VerbatimChar"/>
     <w:rPr>
@@ -3243,7 +4281,7 @@
       <w:i/>
     </w:rPr>
   </w:style>
-  <w:style w:type="character" w:customStyle="1" w:styleId="DocumentationTok">
+  <w:style w:customStyle="1" w:styleId="DocumentationTok" w:type="character">
     <w:name w:val="DocumentationTok"/>
     <w:basedOn w:val="VerbatimChar"/>
     <w:rPr>
@@ -3251,7 +4289,7 @@
       <w:i/>
     </w:rPr>
   </w:style>
-  <w:style w:type="character" w:customStyle="1" w:styleId="AnnotationTok">
+  <w:style w:customStyle="1" w:styleId="AnnotationTok" w:type="character">
     <w:name w:val="AnnotationTok"/>
     <w:basedOn w:val="VerbatimChar"/>
     <w:rPr>
@@ -3260,7 +4298,7 @@
       <w:i/>
     </w:rPr>
   </w:style>
-  <w:style w:type="character" w:customStyle="1" w:styleId="CommentVarTok">
+  <w:style w:customStyle="1" w:styleId="CommentVarTok" w:type="character">
     <w:name w:val="CommentVarTok"/>
     <w:basedOn w:val="VerbatimChar"/>
     <w:rPr>
@@ -3269,28 +4307,28 @@
       <w:i/>
     </w:rPr>
   </w:style>
-  <w:style w:type="character" w:customStyle="1" w:styleId="OtherTok">
+  <w:style w:customStyle="1" w:styleId="OtherTok" w:type="character">
     <w:name w:val="OtherTok"/>
     <w:basedOn w:val="VerbatimChar"/>
     <w:rPr>
       <w:color w:val="007020"/>
     </w:rPr>
   </w:style>
-  <w:style w:type="character" w:customStyle="1" w:styleId="FunctionTok">
+  <w:style w:customStyle="1" w:styleId="FunctionTok" w:type="character">
     <w:name w:val="FunctionTok"/>
     <w:basedOn w:val="VerbatimChar"/>
     <w:rPr>
       <w:color w:val="06287e"/>
     </w:rPr>
   </w:style>
-  <w:style w:type="character" w:customStyle="1" w:styleId="VariableTok">
+  <w:style w:customStyle="1" w:styleId="VariableTok" w:type="character">
     <w:name w:val="VariableTok"/>
     <w:basedOn w:val="VerbatimChar"/>
     <w:rPr>
       <w:color w:val="19177c"/>
     </w:rPr>
   </w:style>
-  <w:style w:type="character" w:customStyle="1" w:styleId="ControlFlowTok">
+  <w:style w:customStyle="1" w:styleId="ControlFlowTok" w:type="character">
     <w:name w:val="ControlFlowTok"/>
     <w:basedOn w:val="VerbatimChar"/>
     <w:rPr>
@@ -3298,45 +4336,45 @@
       <w:b/>
     </w:rPr>
   </w:style>
-  <w:style w:type="character" w:customStyle="1" w:styleId="OperatorTok">
+  <w:style w:customStyle="1" w:styleId="OperatorTok" w:type="character">
     <w:name w:val="OperatorTok"/>
     <w:basedOn w:val="VerbatimChar"/>
     <w:rPr>
       <w:color w:val="666666"/>
     </w:rPr>
   </w:style>
-  <w:style w:type="character" w:customStyle="1" w:styleId="BuiltInTok">
+  <w:style w:customStyle="1" w:styleId="BuiltInTok" w:type="character">
     <w:name w:val="BuiltInTok"/>
     <w:basedOn w:val="VerbatimChar"/>
     <w:rPr>
       <w:color w:val="008000"/>
     </w:rPr>
   </w:style>
-  <w:style w:type="character" w:customStyle="1" w:styleId="ExtensionTok">
+  <w:style w:customStyle="1" w:styleId="ExtensionTok" w:type="character">
     <w:name w:val="ExtensionTok"/>
     <w:basedOn w:val="VerbatimChar"/>
     <w:rPr/>
   </w:style>
-  <w:style w:type="character" w:customStyle="1" w:styleId="PreprocessorTok">
+  <w:style w:customStyle="1" w:styleId="PreprocessorTok" w:type="character">
     <w:name w:val="PreprocessorTok"/>
     <w:basedOn w:val="VerbatimChar"/>
     <w:rPr>
       <w:color w:val="bc7a00"/>
     </w:rPr>
   </w:style>
-  <w:style w:type="character" w:customStyle="1" w:styleId="AttributeTok">
+  <w:style w:customStyle="1" w:styleId="AttributeTok" w:type="character">
     <w:name w:val="AttributeTok"/>
     <w:basedOn w:val="VerbatimChar"/>
     <w:rPr>
       <w:color w:val="7d9029"/>
     </w:rPr>
   </w:style>
-  <w:style w:type="character" w:customStyle="1" w:styleId="RegionMarkerTok">
+  <w:style w:customStyle="1" w:styleId="RegionMarkerTok" w:type="character">
     <w:name w:val="RegionMarkerTok"/>
     <w:basedOn w:val="VerbatimChar"/>
     <w:rPr/>
   </w:style>
-  <w:style w:type="character" w:customStyle="1" w:styleId="InformationTok">
+  <w:style w:customStyle="1" w:styleId="InformationTok" w:type="character">
     <w:name w:val="InformationTok"/>
     <w:basedOn w:val="VerbatimChar"/>
     <w:rPr>
@@ -3345,7 +4383,7 @@
       <w:i/>
     </w:rPr>
   </w:style>
-  <w:style w:type="character" w:customStyle="1" w:styleId="WarningTok">
+  <w:style w:customStyle="1" w:styleId="WarningTok" w:type="character">
     <w:name w:val="WarningTok"/>
     <w:basedOn w:val="VerbatimChar"/>
     <w:rPr>
@@ -3354,7 +4392,7 @@
       <w:i/>
     </w:rPr>
   </w:style>
-  <w:style w:type="character" w:customStyle="1" w:styleId="AlertTok">
+  <w:style w:customStyle="1" w:styleId="AlertTok" w:type="character">
     <w:name w:val="AlertTok"/>
     <w:basedOn w:val="VerbatimChar"/>
     <w:rPr>
@@ -3362,7 +4400,7 @@
       <w:b/>
     </w:rPr>
   </w:style>
-  <w:style w:type="character" w:customStyle="1" w:styleId="ErrorTok">
+  <w:style w:customStyle="1" w:styleId="ErrorTok" w:type="character">
     <w:name w:val="ErrorTok"/>
     <w:basedOn w:val="VerbatimChar"/>
     <w:rPr>
@@ -3370,7 +4408,7 @@
       <w:b/>
     </w:rPr>
   </w:style>
-  <w:style w:type="character" w:customStyle="1" w:styleId="NormalTok">
+  <w:style w:customStyle="1" w:styleId="NormalTok" w:type="character">
     <w:name w:val="NormalTok"/>
     <w:basedOn w:val="VerbatimChar"/>
     <w:rPr/>

</xml_diff>

<commit_message>
Translate report to Russian
</commit_message>
<xml_diff>
--- a/steam_coursework_project/docs/CourseWork_Report_SteamLike.docx
+++ b/steam_coursework_project/docs/CourseWork_Report_SteamLike.docx
@@ -7,64 +7,58 @@
         <w:pStyle w:val="Title"/>
       </w:pPr>
       <w:r>
-        <w:t xml:space="preserve">Course</w:t>
-      </w:r>
-      <w:r>
-        <w:t xml:space="preserve"> </w:t>
-      </w:r>
-      <w:r>
-        <w:t xml:space="preserve">Work</w:t>
-      </w:r>
-      <w:r>
-        <w:t xml:space="preserve"> </w:t>
-      </w:r>
-      <w:r>
-        <w:t xml:space="preserve">Report:</w:t>
-      </w:r>
-      <w:r>
-        <w:t xml:space="preserve"> </w:t>
-      </w:r>
-      <w:r>
-        <w:t xml:space="preserve">Digital</w:t>
-      </w:r>
-      <w:r>
-        <w:t xml:space="preserve"> </w:t>
-      </w:r>
-      <w:r>
-        <w:t xml:space="preserve">Game</w:t>
-      </w:r>
-      <w:r>
-        <w:t xml:space="preserve"> </w:t>
-      </w:r>
-      <w:r>
-        <w:t xml:space="preserve">Distribution</w:t>
-      </w:r>
-      <w:r>
-        <w:t xml:space="preserve"> </w:t>
-      </w:r>
-      <w:r>
-        <w:t xml:space="preserve">Platform</w:t>
-      </w:r>
-      <w:r>
-        <w:t xml:space="preserve"> </w:t>
-      </w:r>
-      <w:r>
-        <w:t xml:space="preserve">(Steam-like</w:t>
-      </w:r>
-      <w:r>
-        <w:t xml:space="preserve"> </w:t>
-      </w:r>
-      <w:r>
-        <w:t xml:space="preserve">Service)</w:t>
-      </w:r>
-    </w:p>
-    <w:bookmarkStart w:id="20" w:name="scope"/>
+        <w:t xml:space="preserve">Курсовая</w:t>
+      </w:r>
+      <w:r>
+        <w:t xml:space="preserve"> </w:t>
+      </w:r>
+      <w:r>
+        <w:t xml:space="preserve">работа:</w:t>
+      </w:r>
+      <w:r>
+        <w:t xml:space="preserve"> </w:t>
+      </w:r>
+      <w:r>
+        <w:t xml:space="preserve">платформа</w:t>
+      </w:r>
+      <w:r>
+        <w:t xml:space="preserve"> </w:t>
+      </w:r>
+      <w:r>
+        <w:t xml:space="preserve">цифровой</w:t>
+      </w:r>
+      <w:r>
+        <w:t xml:space="preserve"> </w:t>
+      </w:r>
+      <w:r>
+        <w:t xml:space="preserve">дистрибуции</w:t>
+      </w:r>
+      <w:r>
+        <w:t xml:space="preserve"> </w:t>
+      </w:r>
+      <w:r>
+        <w:t xml:space="preserve">игр</w:t>
+      </w:r>
+      <w:r>
+        <w:t xml:space="preserve"> </w:t>
+      </w:r>
+      <w:r>
+        <w:t xml:space="preserve">(аналог</w:t>
+      </w:r>
+      <w:r>
+        <w:t xml:space="preserve"> </w:t>
+      </w:r>
+      <w:r>
+        <w:t xml:space="preserve">Steam)</w:t>
+      </w:r>
+    </w:p>
+    <w:bookmarkStart w:id="20" w:name="предметная-область"/>
     <w:p>
       <w:pPr>
         <w:pStyle w:val="Heading1"/>
       </w:pPr>
       <w:r>
-        <w:t xml:space="preserve">1. Scope</w:t>
+        <w:t xml:space="preserve">1. Предметная область</w:t>
       </w:r>
     </w:p>
     <w:p>
@@ -72,7 +66,7 @@
         <w:pStyle w:val="FirstParagraph"/>
       </w:pPr>
       <w:r>
-        <w:t xml:space="preserve">The topic is a Steam-like platform. Users buy digital games, add games to a wishlist, write reviews and earn achievements. Business analysts track sales and user activity. The DBMS is PostgreSQL 16. The OLTP and OLAP parts live in two separate databases:</w:t>
+        <w:t xml:space="preserve">Тема работы: платформа в духе Steam. Пользователи покупают цифровые игры, добавляют их в список желаемого, пишут отзывы и получают достижения. Аналитики платформы следят за продажами и активностью пользователей. СУБД: PostgreSQL 16. OLTP и OLAP живут в двух отдельных базах:</w:t>
       </w:r>
       <w:r>
         <w:t xml:space="preserve"> </w:t>
@@ -87,7 +81,7 @@
         <w:t xml:space="preserve"> </w:t>
       </w:r>
       <w:r>
-        <w:t xml:space="preserve">(schema</w:t>
+        <w:t xml:space="preserve">(схема</w:t>
       </w:r>
       <w:r>
         <w:t xml:space="preserve"> </w:t>
@@ -99,7 +93,7 @@
         <w:t xml:space="preserve">steam_oltp</w:t>
       </w:r>
       <w:r>
-        <w:t xml:space="preserve">) and</w:t>
+        <w:t xml:space="preserve">) и</w:t>
       </w:r>
       <w:r>
         <w:t xml:space="preserve"> </w:t>
@@ -114,7 +108,7 @@
         <w:t xml:space="preserve"> </w:t>
       </w:r>
       <w:r>
-        <w:t xml:space="preserve">(schema</w:t>
+        <w:t xml:space="preserve">(схема</w:t>
       </w:r>
       <w:r>
         <w:t xml:space="preserve"> </w:t>
@@ -130,13 +124,13 @@
       </w:r>
     </w:p>
     <w:bookmarkEnd w:id="20"/>
-    <w:bookmarkStart w:id="24" w:name="oltp-database-context"/>
+    <w:bookmarkStart w:id="24" w:name="oltp-база-данных"/>
     <w:p>
       <w:pPr>
         <w:pStyle w:val="Heading1"/>
       </w:pPr>
       <w:r>
-        <w:t xml:space="preserve">2. OLTP database context</w:t>
+        <w:t xml:space="preserve">2. OLTP-база данных</w:t>
       </w:r>
     </w:p>
     <w:p>
@@ -144,7 +138,7 @@
         <w:pStyle w:val="FirstParagraph"/>
       </w:pPr>
       <w:r>
-        <w:t xml:space="preserve">The OLTP database stores accounts, countries, games, developers, publishers, genres, purchases, reviews, achievements, wishlists and the price history of every game. The schema has 13 tables in 3NF. Many-to-many links (games and genres, users and achievements) use junction tables. Every non-key attribute depends only on the key of its table.</w:t>
+        <w:t xml:space="preserve">OLTP-база хранит учётные записи, страны, игры, разработчиков, издателей, жанры, покупки, отзывы, достижения, списки желаемого и историю цен каждой игры. Схема состоит из 13 таблиц в третьей нормальной форме. Связи «многие ко многим» (игры и жанры, пользователи и достижения) идут через связующие таблицы. Каждый неключевой атрибут зависит только от ключа своей таблицы.</w:t>
       </w:r>
     </w:p>
     <w:p>
@@ -156,7 +150,7 @@
           <wp:inline>
             <wp:extent cx="5334000" cy="4435748"/>
             <wp:effectExtent b="0" l="0" r="0" t="0"/>
-            <wp:docPr descr="OLTP logical schema" title="" id="22" name="Picture"/>
+            <wp:docPr descr="Логическая схема OLTP" title="" id="22" name="Picture"/>
             <a:graphic>
               <a:graphicData uri="http://schemas.openxmlformats.org/drawingml/2006/picture">
                 <pic:pic>
@@ -199,7 +193,7 @@
         <w:pStyle w:val="ImageCaption"/>
       </w:pPr>
       <w:r>
-        <w:t xml:space="preserve">OLTP logical schema</w:t>
+        <w:t xml:space="preserve">Логическая схема OLTP</w:t>
       </w:r>
     </w:p>
     <w:tbl>
@@ -226,31 +220,31 @@
               <w:jc w:val="left"/>
             </w:pPr>
             <w:r>
-              <w:t xml:space="preserve">Table</w:t>
-            </w:r>
-          </w:p>
-        </w:tc>
-        <w:tc>
-          <w:tcPr/>
-          <w:p>
-            <w:pPr>
-              <w:pStyle w:val="Compact"/>
-              <w:jc w:val="left"/>
-            </w:pPr>
-            <w:r>
-              <w:t xml:space="preserve">Purpose</w:t>
-            </w:r>
-          </w:p>
-        </w:tc>
-        <w:tc>
-          <w:tcPr/>
-          <w:p>
-            <w:pPr>
-              <w:pStyle w:val="Compact"/>
-              <w:jc w:val="left"/>
-            </w:pPr>
-            <w:r>
-              <w:t xml:space="preserve">Key and constraints</w:t>
+              <w:t xml:space="preserve">Таблица</w:t>
+            </w:r>
+          </w:p>
+        </w:tc>
+        <w:tc>
+          <w:tcPr/>
+          <w:p>
+            <w:pPr>
+              <w:pStyle w:val="Compact"/>
+              <w:jc w:val="left"/>
+            </w:pPr>
+            <w:r>
+              <w:t xml:space="preserve">Назначение</w:t>
+            </w:r>
+          </w:p>
+        </w:tc>
+        <w:tc>
+          <w:tcPr/>
+          <w:p>
+            <w:pPr>
+              <w:pStyle w:val="Compact"/>
+              <w:jc w:val="left"/>
+            </w:pPr>
+            <w:r>
+              <w:t xml:space="preserve">Ключи и ограничения</w:t>
             </w:r>
           </w:p>
         </w:tc>
@@ -276,7 +270,7 @@
               <w:jc w:val="left"/>
             </w:pPr>
             <w:r>
-              <w:t xml:space="preserve">Country reference</w:t>
+              <w:t xml:space="preserve">Справочник стран</w:t>
             </w:r>
           </w:p>
         </w:tc>
@@ -314,19 +308,19 @@
               <w:jc w:val="left"/>
             </w:pPr>
             <w:r>
-              <w:t xml:space="preserve">Customer accounts</w:t>
-            </w:r>
-          </w:p>
-        </w:tc>
-        <w:tc>
-          <w:tcPr/>
-          <w:p>
-            <w:pPr>
-              <w:pStyle w:val="Compact"/>
-              <w:jc w:val="left"/>
-            </w:pPr>
-            <w:r>
-              <w:t xml:space="preserve">PK user_id, UNIQUE username and email, FK country_id</w:t>
+              <w:t xml:space="preserve">Учётные записи покупателей</w:t>
+            </w:r>
+          </w:p>
+        </w:tc>
+        <w:tc>
+          <w:tcPr/>
+          <w:p>
+            <w:pPr>
+              <w:pStyle w:val="Compact"/>
+              <w:jc w:val="left"/>
+            </w:pPr>
+            <w:r>
+              <w:t xml:space="preserve">PK user_id, UNIQUE username и email, FK country_id</w:t>
             </w:r>
           </w:p>
         </w:tc>
@@ -352,7 +346,7 @@
               <w:jc w:val="left"/>
             </w:pPr>
             <w:r>
-              <w:t xml:space="preserve">Studios and publishers</w:t>
+              <w:t xml:space="preserve">Студии-разработчики и издатели</w:t>
             </w:r>
           </w:p>
         </w:tc>
@@ -390,19 +384,19 @@
               <w:jc w:val="left"/>
             </w:pPr>
             <w:r>
-              <w:t xml:space="preserve">Game catalog</w:t>
-            </w:r>
-          </w:p>
-        </w:tc>
-        <w:tc>
-          <w:tcPr/>
-          <w:p>
-            <w:pPr>
-              <w:pStyle w:val="Compact"/>
-              <w:jc w:val="left"/>
-            </w:pPr>
-            <w:r>
-              <w:t xml:space="preserve">PK game_id, UNIQUE game_slug, FK developer_id and publisher_id, CHECK base_price &gt;= 0</w:t>
+              <w:t xml:space="preserve">Каталог игр</w:t>
+            </w:r>
+          </w:p>
+        </w:tc>
+        <w:tc>
+          <w:tcPr/>
+          <w:p>
+            <w:pPr>
+              <w:pStyle w:val="Compact"/>
+              <w:jc w:val="left"/>
+            </w:pPr>
+            <w:r>
+              <w:t xml:space="preserve">PK game_id, UNIQUE game_slug, FK developer_id и publisher_id, CHECK base_price &gt;= 0</w:t>
             </w:r>
           </w:p>
         </w:tc>
@@ -428,7 +422,7 @@
               <w:jc w:val="left"/>
             </w:pPr>
             <w:r>
-              <w:t xml:space="preserve">Genre dictionary and link</w:t>
+              <w:t xml:space="preserve">Справочник жанров и связь игр с жанрами</w:t>
             </w:r>
           </w:p>
         </w:tc>
@@ -466,19 +460,19 @@
               <w:jc w:val="left"/>
             </w:pPr>
             <w:r>
-              <w:t xml:space="preserve">Purchase transactions</w:t>
-            </w:r>
-          </w:p>
-        </w:tc>
-        <w:tc>
-          <w:tcPr/>
-          <w:p>
-            <w:pPr>
-              <w:pStyle w:val="Compact"/>
-              <w:jc w:val="left"/>
-            </w:pPr>
-            <w:r>
-              <w:t xml:space="preserve">UNIQUE purchase_code, UNIQUE (user_id, game_id), CHECK discount 0 to 100, payment method card or wallet</w:t>
+              <w:t xml:space="preserve">Покупки</w:t>
+            </w:r>
+          </w:p>
+        </w:tc>
+        <w:tc>
+          <w:tcPr/>
+          <w:p>
+            <w:pPr>
+              <w:pStyle w:val="Compact"/>
+              <w:jc w:val="left"/>
+            </w:pPr>
+            <w:r>
+              <w:t xml:space="preserve">UNIQUE purchase_code, UNIQUE (user_id, game_id), CHECK скидка от 0 до 100, способ оплаты card или wallet</w:t>
             </w:r>
           </w:p>
         </w:tc>
@@ -504,19 +498,19 @@
               <w:jc w:val="left"/>
             </w:pPr>
             <w:r>
-              <w:t xml:space="preserve">Ratings and comments</w:t>
-            </w:r>
-          </w:p>
-        </w:tc>
-        <w:tc>
-          <w:tcPr/>
-          <w:p>
-            <w:pPr>
-              <w:pStyle w:val="Compact"/>
-              <w:jc w:val="left"/>
-            </w:pPr>
-            <w:r>
-              <w:t xml:space="preserve">UNIQUE (user_id, game_id), CHECK rating 1 to 5</w:t>
+              <w:t xml:space="preserve">Оценки и комментарии</w:t>
+            </w:r>
+          </w:p>
+        </w:tc>
+        <w:tc>
+          <w:tcPr/>
+          <w:p>
+            <w:pPr>
+              <w:pStyle w:val="Compact"/>
+              <w:jc w:val="left"/>
+            </w:pPr>
+            <w:r>
+              <w:t xml:space="preserve">UNIQUE (user_id, game_id), CHECK оценка от 1 до 5</w:t>
             </w:r>
           </w:p>
         </w:tc>
@@ -542,7 +536,7 @@
               <w:jc w:val="left"/>
             </w:pPr>
             <w:r>
-              <w:t xml:space="preserve">Achievements per game and who earned them</w:t>
+              <w:t xml:space="preserve">Достижения игр и кто их получил</w:t>
             </w:r>
           </w:p>
         </w:tc>
@@ -580,7 +574,7 @@
               <w:jc w:val="left"/>
             </w:pPr>
             <w:r>
-              <w:t xml:space="preserve">Saved games</w:t>
+              <w:t xml:space="preserve">Список желаемого</w:t>
             </w:r>
           </w:p>
         </w:tc>
@@ -618,19 +612,19 @@
               <w:jc w:val="left"/>
             </w:pPr>
             <w:r>
-              <w:t xml:space="preserve">Price versions of a game</w:t>
-            </w:r>
-          </w:p>
-        </w:tc>
-        <w:tc>
-          <w:tcPr/>
-          <w:p>
-            <w:pPr>
-              <w:pStyle w:val="Compact"/>
-              <w:jc w:val="left"/>
-            </w:pPr>
-            <w:r>
-              <w:t xml:space="preserve">UNIQUE (game_id, valid_from), exclusion constraint against overlapping intervals, one open interval per game</w:t>
+              <w:t xml:space="preserve">Версии цены игры</w:t>
+            </w:r>
+          </w:p>
+        </w:tc>
+        <w:tc>
+          <w:tcPr/>
+          <w:p>
+            <w:pPr>
+              <w:pStyle w:val="Compact"/>
+              <w:jc w:val="left"/>
+            </w:pPr>
+            <w:r>
+              <w:t xml:space="preserve">UNIQUE (game_id, valid_from), ограничение-исключение против пересекающихся интервалов, одна открытая цена на игру</w:t>
             </w:r>
           </w:p>
         </w:tc>
@@ -650,7 +644,7 @@
         <w:t xml:space="preserve"> </w:t>
       </w:r>
       <w:r>
-        <w:t xml:space="preserve">is the launch list price. The price valid on a given day comes from</w:t>
+        <w:t xml:space="preserve">хранит цену на момент релиза. Цену, которая действовала в конкретный день, база берёт из</w:t>
       </w:r>
       <w:r>
         <w:t xml:space="preserve"> </w:t>
@@ -662,19 +656,19 @@
         <w:t xml:space="preserve">price_history</w:t>
       </w:r>
       <w:r>
-        <w:t xml:space="preserve">. A purchase stores</w:t>
-      </w:r>
-      <w:r>
-        <w:t xml:space="preserve"> </w:t>
-      </w:r>
-      <w:r>
-        <w:rPr>
-          <w:rStyle w:val="VerbatimChar"/>
-        </w:rPr>
-        <w:t xml:space="preserve">paid_amount = list price on purchase date * (1 - discount_percent / 100)</w:t>
-      </w:r>
-      <w:r>
-        <w:t xml:space="preserve">. The function</w:t>
+        <w:t xml:space="preserve">. Покупка хранит</w:t>
+      </w:r>
+      <w:r>
+        <w:t xml:space="preserve"> </w:t>
+      </w:r>
+      <w:r>
+        <w:rPr>
+          <w:rStyle w:val="VerbatimChar"/>
+        </w:rPr>
+        <w:t xml:space="preserve">paid_amount = цена на дату покупки * (1 - discount_percent / 100)</w:t>
+      </w:r>
+      <w:r>
+        <w:t xml:space="preserve">. Функция</w:t>
       </w:r>
       <w:r>
         <w:t xml:space="preserve"> </w:t>
@@ -689,17 +683,17 @@
         <w:t xml:space="preserve"> </w:t>
       </w:r>
       <w:r>
-        <w:t xml:space="preserve">closes the open interval and opens a new one.</w:t>
+        <w:t xml:space="preserve">закрывает открытый интервал цены и открывает новый.</w:t>
       </w:r>
     </w:p>
     <w:bookmarkEnd w:id="24"/>
-    <w:bookmarkStart w:id="25" w:name="data-and-loading"/>
+    <w:bookmarkStart w:id="25" w:name="данные-и-загрузка"/>
     <w:p>
       <w:pPr>
         <w:pStyle w:val="Heading1"/>
       </w:pPr>
       <w:r>
-        <w:t xml:space="preserve">3. Data and loading</w:t>
+        <w:t xml:space="preserve">3. Данные и загрузка</w:t>
       </w:r>
     </w:p>
     <w:p>
@@ -707,7 +701,7 @@
         <w:pStyle w:val="FirstParagraph"/>
       </w:pPr>
       <w:r>
-        <w:t xml:space="preserve">The data set has five CSV files, each with one table and no surrogate keys. Rows refer to each other by business identifiers:</w:t>
+        <w:t xml:space="preserve">Набор данных состоит из пяти CSV-файлов, по одной таблице в каждом, без суррогатных ключей. Строки ссылаются друг на друга через бизнес-идентификаторы:</w:t>
       </w:r>
       <w:r>
         <w:t xml:space="preserve"> </w:t>
@@ -781,19 +775,19 @@
               <w:jc w:val="left"/>
             </w:pPr>
             <w:r>
-              <w:t xml:space="preserve">File</w:t>
-            </w:r>
-          </w:p>
-        </w:tc>
-        <w:tc>
-          <w:tcPr/>
-          <w:p>
-            <w:pPr>
-              <w:pStyle w:val="Compact"/>
-              <w:jc w:val="left"/>
-            </w:pPr>
-            <w:r>
-              <w:t xml:space="preserve">Content</w:t>
+              <w:t xml:space="preserve">Файл</w:t>
+            </w:r>
+          </w:p>
+        </w:tc>
+        <w:tc>
+          <w:tcPr/>
+          <w:p>
+            <w:pPr>
+              <w:pStyle w:val="Compact"/>
+              <w:jc w:val="left"/>
+            </w:pPr>
+            <w:r>
+              <w:t xml:space="preserve">Содержимое</w:t>
             </w:r>
           </w:p>
         </w:tc>
@@ -819,7 +813,7 @@
               <w:jc w:val="left"/>
             </w:pPr>
             <w:r>
-              <w:t xml:space="preserve">60 accounts with country and registration date</w:t>
+              <w:t xml:space="preserve">60 учётных записей со страной и датой регистрации</w:t>
             </w:r>
           </w:p>
         </w:tc>
@@ -845,7 +839,7 @@
               <w:jc w:val="left"/>
             </w:pPr>
             <w:r>
-              <w:t xml:space="preserve">12 games with developer, publisher, their countries and genres separated by</w:t>
+              <w:t xml:space="preserve">12 игр с разработчиком, издателем, их странами и жанрами через</w:t>
             </w:r>
             <w:r>
               <w:t xml:space="preserve"> </w:t>
@@ -880,7 +874,7 @@
               <w:jc w:val="left"/>
             </w:pPr>
             <w:r>
-              <w:t xml:space="preserve">42 price intervals, non-overlapping</w:t>
+              <w:t xml:space="preserve">42 непересекающихся интервала цен</w:t>
             </w:r>
           </w:p>
         </w:tc>
@@ -906,7 +900,7 @@
               <w:jc w:val="left"/>
             </w:pPr>
             <w:r>
-              <w:t xml:space="preserve">165 purchases, one per user and game</w:t>
+              <w:t xml:space="preserve">165 покупок, не больше одной на пару пользователь и игра</w:t>
             </w:r>
           </w:p>
         </w:tc>
@@ -932,7 +926,7 @@
               <w:jc w:val="left"/>
             </w:pPr>
             <w:r>
-              <w:t xml:space="preserve">544 events:</w:t>
+              <w:t xml:space="preserve">544 события: строки</w:t>
             </w:r>
             <w:r>
               <w:t xml:space="preserve"> </w:t>
@@ -959,7 +953,7 @@
               <w:t xml:space="preserve"> </w:t>
             </w:r>
             <w:r>
-              <w:t xml:space="preserve">and</w:t>
+              <w:t xml:space="preserve">и</w:t>
             </w:r>
             <w:r>
               <w:t xml:space="preserve"> </w:t>
@@ -974,7 +968,7 @@
               <w:t xml:space="preserve"> </w:t>
             </w:r>
             <w:r>
-              <w:t xml:space="preserve">rows in one file</w:t>
+              <w:t xml:space="preserve">в одном файле</w:t>
             </w:r>
           </w:p>
         </w:tc>
@@ -994,7 +988,7 @@
         <w:t xml:space="preserve"> </w:t>
       </w:r>
       <w:r>
-        <w:t xml:space="preserve">rebuilds the files with a fixed seed. It enforces these rules: one purchase and one review per user and game, no purchase before registration or release, reviews and achievements after the purchase, achievements only for owned games, and</w:t>
+        <w:t xml:space="preserve">пересоздаёт файлы с фиксированным seed и соблюдает правила: одна покупка и один отзыв на пару пользователь и игра, покупка не раньше регистрации и релиза, отзывы и достижения после покупки, достижения только по купленным играм,</w:t>
       </w:r>
       <w:r>
         <w:t xml:space="preserve"> </w:t>
@@ -1009,7 +1003,7 @@
         <w:t xml:space="preserve"> </w:t>
       </w:r>
       <w:r>
-        <w:t xml:space="preserve">computed from the price version valid on the purchase date. Countries are a fixed dictionary inside the load script.</w:t>
+        <w:t xml:space="preserve">считается от цены, действовавшей на дату покупки. Страны заданы фиксированным справочником внутри скрипта загрузки.</w:t>
       </w:r>
     </w:p>
     <w:p>
@@ -1026,29 +1020,29 @@
         <w:t xml:space="preserve"> </w:t>
       </w:r>
       <w:r>
-        <w:t xml:space="preserve">loads each file into a temporary staging table and resolves business identifiers to foreign keys. Every upsert uses</w:t>
-      </w:r>
-      <w:r>
-        <w:t xml:space="preserve"> </w:t>
-      </w:r>
-      <w:r>
-        <w:rPr>
-          <w:rStyle w:val="VerbatimChar"/>
-        </w:rPr>
-        <w:t xml:space="preserve">ON CONFLICT ... DO UPDATE ... WHERE (old values) IS DISTINCT FROM (new values)</w:t>
-      </w:r>
-      <w:r>
-        <w:t xml:space="preserve">. A row whose values did not change is not touched, and the script can run any number of times. A closed price interval is history: the loader never reopens it. The whole load runs in one transaction. At the end it prints the number of CSV rows that could not be matched to a user, game or country (expected: 0).</w:t>
+        <w:t xml:space="preserve">загружает каждый файл во временную staging-таблицу и находит по бизнес-идентификаторам внешние ключи. Каждая вставка использует</w:t>
+      </w:r>
+      <w:r>
+        <w:t xml:space="preserve"> </w:t>
+      </w:r>
+      <w:r>
+        <w:rPr>
+          <w:rStyle w:val="VerbatimChar"/>
+        </w:rPr>
+        <w:t xml:space="preserve">ON CONFLICT ... DO UPDATE ... WHERE (старые значения) IS DISTINCT FROM (новые значения)</w:t>
+      </w:r>
+      <w:r>
+        <w:t xml:space="preserve">. Скрипт не трогает строку, если её значения не изменились, поэтому его можно запускать сколько угодно раз. Закрытый интервал цены считается историей, и загрузчик его не переоткрывает. Вся загрузка идёт в одной транзакции. В конце скрипт выводит число строк CSV, для которых не нашлись пользователь, игра или страна (ожидается 0).</w:t>
       </w:r>
     </w:p>
     <w:bookmarkEnd w:id="25"/>
-    <w:bookmarkStart w:id="29" w:name="olap-database-context"/>
+    <w:bookmarkStart w:id="29" w:name="olap-база-данных"/>
     <w:p>
       <w:pPr>
         <w:pStyle w:val="Heading1"/>
       </w:pPr>
       <w:r>
-        <w:t xml:space="preserve">4. OLAP database context</w:t>
+        <w:t xml:space="preserve">4. OLAP-база данных</w:t>
       </w:r>
     </w:p>
     <w:p>
@@ -1056,7 +1050,7 @@
         <w:pStyle w:val="FirstParagraph"/>
       </w:pPr>
       <w:r>
-        <w:t xml:space="preserve">The warehouse answers these questions:</w:t>
+        <w:t xml:space="preserve">Хранилище отвечает на вопросы:</w:t>
       </w:r>
     </w:p>
     <w:p>
@@ -1068,7 +1062,7 @@
         <w:pStyle w:val="Compact"/>
       </w:pPr>
       <w:r>
-        <w:t xml:space="preserve">Which games and genres bring the highest revenue?</w:t>
+        <w:t xml:space="preserve">Какие игры и жанры приносят больше всего выручки?</w:t>
       </w:r>
     </w:p>
     <w:p>
@@ -1080,7 +1074,7 @@
         <w:pStyle w:val="Compact"/>
       </w:pPr>
       <w:r>
-        <w:t xml:space="preserve">How do revenue, units and discounts change by month and year?</w:t>
+        <w:t xml:space="preserve">Как меняются выручка, число продаж и скидки по месяцам и годам?</w:t>
       </w:r>
     </w:p>
     <w:p>
@@ -1092,7 +1086,7 @@
         <w:pStyle w:val="Compact"/>
       </w:pPr>
       <w:r>
-        <w:t xml:space="preserve">Which countries and regions buy the most?</w:t>
+        <w:t xml:space="preserve">Какие страны и регионы покупают больше всего?</w:t>
       </w:r>
     </w:p>
     <w:p>
@@ -1104,7 +1098,7 @@
         <w:pStyle w:val="Compact"/>
       </w:pPr>
       <w:r>
-        <w:t xml:space="preserve">How do current prices relate to historical sales, and what did each price version earn?</w:t>
+        <w:t xml:space="preserve">Как текущие цены соотносятся с прошлыми продажами и сколько заработала каждая версия цены?</w:t>
       </w:r>
     </w:p>
     <w:p>
@@ -1116,7 +1110,7 @@
         <w:pStyle w:val="Compact"/>
       </w:pPr>
       <w:r>
-        <w:t xml:space="preserve">How do reviews, achievements and wishlist adds relate to engagement per game?</w:t>
+        <w:t xml:space="preserve">Как отзывы, достижения и добавления в список желаемого отражают вовлечённость по играм?</w:t>
       </w:r>
     </w:p>
     <w:p>
@@ -1128,7 +1122,7 @@
           <wp:inline>
             <wp:extent cx="5334000" cy="3686868"/>
             <wp:effectExtent b="0" l="0" r="0" t="0"/>
-            <wp:docPr descr="OLAP logical schema" title="" id="27" name="Picture"/>
+            <wp:docPr descr="Логическая схема OLAP" title="" id="27" name="Picture"/>
             <a:graphic>
               <a:graphicData uri="http://schemas.openxmlformats.org/drawingml/2006/picture">
                 <pic:pic>
@@ -1171,7 +1165,7 @@
         <w:pStyle w:val="ImageCaption"/>
       </w:pPr>
       <w:r>
-        <w:t xml:space="preserve">OLAP logical schema</w:t>
+        <w:t xml:space="preserve">Логическая схема OLAP</w:t>
       </w:r>
     </w:p>
     <w:tbl>
@@ -1197,19 +1191,19 @@
               <w:jc w:val="left"/>
             </w:pPr>
             <w:r>
-              <w:t xml:space="preserve">Object</w:t>
-            </w:r>
-          </w:p>
-        </w:tc>
-        <w:tc>
-          <w:tcPr/>
-          <w:p>
-            <w:pPr>
-              <w:pStyle w:val="Compact"/>
-              <w:jc w:val="left"/>
-            </w:pPr>
-            <w:r>
-              <w:t xml:space="preserve">Role</w:t>
+              <w:t xml:space="preserve">Объект</w:t>
+            </w:r>
+          </w:p>
+        </w:tc>
+        <w:tc>
+          <w:tcPr/>
+          <w:p>
+            <w:pPr>
+              <w:pStyle w:val="Compact"/>
+              <w:jc w:val="left"/>
+            </w:pPr>
+            <w:r>
+              <w:t xml:space="preserve">Роль</w:t>
             </w:r>
           </w:p>
         </w:tc>
@@ -1235,7 +1229,7 @@
               <w:jc w:val="left"/>
             </w:pPr>
             <w:r>
-              <w:t xml:space="preserve">Fact 1. One row per purchase: units, gross revenue (list price of the SCD version), discount, net revenue</w:t>
+              <w:t xml:space="preserve">Факт 1. Одна строка на покупку: количество, валовая выручка (цена версии SCD), скидка, чистая выручка</w:t>
             </w:r>
           </w:p>
         </w:tc>
@@ -1261,7 +1255,7 @@
               <w:jc w:val="left"/>
             </w:pPr>
             <w:r>
-              <w:t xml:space="preserve">Fact 2, aggregated. Reviews, achievements, points, wishlist adds and average rating per day, user and game</w:t>
+              <w:t xml:space="preserve">Факт 2, агрегированный. Отзывы, достижения, очки, добавления в список желаемого и средняя оценка за день по пользователю и игре</w:t>
             </w:r>
           </w:p>
         </w:tc>
@@ -1313,7 +1307,7 @@
               <w:jc w:val="left"/>
             </w:pPr>
             <w:r>
-              <w:t xml:space="preserve">Bridge between games and genres with weight 1 / number of genres</w:t>
+              <w:t xml:space="preserve">Bridge-таблица между играми и жанрами с весом 1 / число жанров</w:t>
             </w:r>
           </w:p>
         </w:tc>
@@ -1339,7 +1333,7 @@
               <w:jc w:val="left"/>
             </w:pPr>
             <w:r>
-              <w:t xml:space="preserve">Dimensions</w:t>
+              <w:t xml:space="preserve">Измерения</w:t>
             </w:r>
           </w:p>
         </w:tc>
@@ -1365,7 +1359,7 @@
               <w:jc w:val="left"/>
             </w:pPr>
             <w:r>
-              <w:t xml:space="preserve">Snowflaked: user, developer and publisher point to dim_country</w:t>
+              <w:t xml:space="preserve">Snowflake: пользователь, разработчик и издатель ссылаются на dim_country</w:t>
             </w:r>
           </w:p>
         </w:tc>
@@ -1391,7 +1385,7 @@
               <w:jc w:val="left"/>
             </w:pPr>
             <w:r>
-              <w:t xml:space="preserve">Records the ETL refused to load, with the reason</w:t>
+              <w:t xml:space="preserve">Записи, которые ETL отказался загружать, с причиной</w:t>
             </w:r>
           </w:p>
         </w:tc>
@@ -1402,7 +1396,7 @@
         <w:pStyle w:val="BodyText"/>
       </w:pPr>
       <w:r>
-        <w:t xml:space="preserve">The model differs from OLTP in three ways. Facts hold measures (gross revenue, discount, net revenue, points) that OLTP does not store.</w:t>
+        <w:t xml:space="preserve">Модель отличается от OLTP тремя вещами. Факты хранят меры (валовая выручка, скидка, чистая выручка, очки), которых нет в OLTP.</w:t>
       </w:r>
       <w:r>
         <w:t xml:space="preserve"> </w:t>
@@ -1417,7 +1411,7 @@
         <w:t xml:space="preserve"> </w:t>
       </w:r>
       <w:r>
-        <w:t xml:space="preserve">merges three OLTP tables into one aggregated grain. Genres are reached through a weighted bridge, so allocated revenue adds up to the total.</w:t>
+        <w:t xml:space="preserve">сводит три таблицы OLTP в одну агрегированную строку за день. Жанры подключены через bridge-таблицу с весами, поэтому выручка по жанрам в сумме равна общей выручке.</w:t>
       </w:r>
     </w:p>
     <w:bookmarkEnd w:id="29"/>
@@ -1444,7 +1438,7 @@
         <w:t xml:space="preserve"> </w:t>
       </w:r>
       <w:r>
-        <w:t xml:space="preserve">connects the DWH database to the OLTP database through</w:t>
+        <w:t xml:space="preserve">подключает хранилище к OLTP-базе через</w:t>
       </w:r>
       <w:r>
         <w:t xml:space="preserve"> </w:t>
@@ -1459,7 +1453,7 @@
         <w:t xml:space="preserve"> </w:t>
       </w:r>
       <w:r>
-        <w:t xml:space="preserve">and runs these steps in one transaction:</w:t>
+        <w:t xml:space="preserve">и выполняет шаги в одной транзакции:</w:t>
       </w:r>
     </w:p>
     <w:p>
@@ -1475,13 +1469,13 @@
           <w:bCs/>
           <w:b/>
         </w:rPr>
-        <w:t xml:space="preserve">Reference data.</w:t>
-      </w:r>
-      <w:r>
-        <w:t xml:space="preserve"> </w:t>
-      </w:r>
-      <w:r>
-        <w:t xml:space="preserve">Countries, payment methods and a calendar from 2025-01-01 to 2026-12-31 define the permissible values.</w:t>
+        <w:t xml:space="preserve">Справочные данные.</w:t>
+      </w:r>
+      <w:r>
+        <w:t xml:space="preserve"> </w:t>
+      </w:r>
+      <w:r>
+        <w:t xml:space="preserve">Страны, способы оплаты и календарь с 2025-01-01 по 2026-12-31 задают допустимые значения.</w:t>
       </w:r>
     </w:p>
     <w:p>
@@ -1497,13 +1491,13 @@
           <w:bCs/>
           <w:b/>
         </w:rPr>
-        <w:t xml:space="preserve">Dimensions.</w:t>
-      </w:r>
-      <w:r>
-        <w:t xml:space="preserve"> </w:t>
-      </w:r>
-      <w:r>
-        <w:t xml:space="preserve">Upserts with the same</w:t>
+        <w:t xml:space="preserve">Измерения.</w:t>
+      </w:r>
+      <w:r>
+        <w:t xml:space="preserve"> </w:t>
+      </w:r>
+      <w:r>
+        <w:t xml:space="preserve">Вставка с той же проверкой</w:t>
       </w:r>
       <w:r>
         <w:t xml:space="preserve"> </w:t>
@@ -1515,10 +1509,7 @@
         <w:t xml:space="preserve">IS DISTINCT FROM</w:t>
       </w:r>
       <w:r>
-        <w:t xml:space="preserve"> </w:t>
-      </w:r>
-      <w:r>
-        <w:t xml:space="preserve">guard as the loader.</w:t>
+        <w:t xml:space="preserve">, что и в загрузчике.</w:t>
       </w:r>
     </w:p>
     <w:p>
@@ -1540,7 +1531,7 @@
         <w:t xml:space="preserve"> </w:t>
       </w:r>
       <w:r>
-        <w:t xml:space="preserve">A version that ended in OLTP gets</w:t>
+        <w:t xml:space="preserve">Версия, которая закончилась в OLTP, получает</w:t>
       </w:r>
       <w:r>
         <w:t xml:space="preserve"> </w:t>
@@ -1555,7 +1546,7 @@
         <w:t xml:space="preserve"> </w:t>
       </w:r>
       <w:r>
-        <w:t xml:space="preserve">and</w:t>
+        <w:t xml:space="preserve">и</w:t>
       </w:r>
       <w:r>
         <w:t xml:space="preserve"> </w:t>
@@ -1567,7 +1558,7 @@
         <w:t xml:space="preserve">is_current = FALSE</w:t>
       </w:r>
       <w:r>
-        <w:t xml:space="preserve">. A price version that does not exist yet becomes a new row. A different price for an existing version is refused and logged, because history is immutable.</w:t>
+        <w:t xml:space="preserve">. Новая версия цены становится новой строкой. Если цена существующей версии в OLTP изменилась, ETL отказывает и пишет это в журнал: история неизменна.</w:t>
       </w:r>
     </w:p>
     <w:p>
@@ -1589,7 +1580,7 @@
         <w:t xml:space="preserve"> </w:t>
       </w:r>
       <w:r>
-        <w:t xml:space="preserve">Staging table</w:t>
+        <w:t xml:space="preserve">Данные попадают в staging-таблицу</w:t>
       </w:r>
       <w:r>
         <w:t xml:space="preserve"> </w:t>
@@ -1601,7 +1592,10 @@
         <w:t xml:space="preserve">steam_stg.stg_sales</w:t>
       </w:r>
       <w:r>
-        <w:t xml:space="preserve">, then validation: date inside the calendar, known user, game and payment method, a price version valid on the purchase date, discount 0 to 100, no negative amount, no purchase before registration,</w:t>
+        <w:t xml:space="preserve"> </w:t>
+      </w:r>
+      <w:r>
+        <w:t xml:space="preserve">и проходят проверки: дата внутри календаря, известны пользователь, игра и способ оплаты, на дату покупки есть версия цены, скидка от 0 до 100, сумма не отрицательная, покупка не раньше регистрации,</w:t>
       </w:r>
       <w:r>
         <w:t xml:space="preserve"> </w:t>
@@ -1616,7 +1610,7 @@
         <w:t xml:space="preserve"> </w:t>
       </w:r>
       <w:r>
-        <w:t xml:space="preserve">equal to list price and discount within one cent. Rejected rows go to</w:t>
+        <w:t xml:space="preserve">совпадает с ценой и скидкой с точностью до цента. Отклонённые строки уходят в</w:t>
       </w:r>
       <w:r>
         <w:t xml:space="preserve"> </w:t>
@@ -1628,7 +1622,7 @@
         <w:t xml:space="preserve">etl_rejects</w:t>
       </w:r>
       <w:r>
-        <w:t xml:space="preserve">, valid rows are published.</w:t>
+        <w:t xml:space="preserve">, корректные публикуются.</w:t>
       </w:r>
     </w:p>
     <w:p>
@@ -1650,7 +1644,7 @@
         <w:t xml:space="preserve"> </w:t>
       </w:r>
       <w:r>
-        <w:t xml:space="preserve">Reviews, achievements and wishlist rows enter</w:t>
+        <w:t xml:space="preserve">Отзывы, достижения и строки списка желаемого попадают в</w:t>
       </w:r>
       <w:r>
         <w:t xml:space="preserve"> </w:t>
@@ -1662,7 +1656,7 @@
         <w:t xml:space="preserve">steam_stg.stg_activity</w:t>
       </w:r>
       <w:r>
-        <w:t xml:space="preserve">, pass validation (dates, keys, rating 1 to 5), then are aggregated and published.</w:t>
+        <w:t xml:space="preserve">, проходят проверки (даты, ключи, оценка от 1 до 5), затем агрегируются и публикуются.</w:t>
       </w:r>
     </w:p>
     <w:p>
@@ -1678,23 +1672,23 @@
           <w:bCs/>
           <w:b/>
         </w:rPr>
-        <w:t xml:space="preserve">Control totals.</w:t>
-      </w:r>
-      <w:r>
-        <w:t xml:space="preserve"> </w:t>
-      </w:r>
-      <w:r>
-        <w:t xml:space="preserve">Row counts and net revenue are printed.</w:t>
+        <w:t xml:space="preserve">Контрольные суммы.</w:t>
+      </w:r>
+      <w:r>
+        <w:t xml:space="preserve"> </w:t>
+      </w:r>
+      <w:r>
+        <w:t xml:space="preserve">Скрипт выводит число строк и чистую выручку.</w:t>
       </w:r>
     </w:p>
     <w:bookmarkEnd w:id="30"/>
-    <w:bookmarkStart w:id="31" w:name="run-order"/>
+    <w:bookmarkStart w:id="31" w:name="порядок-запуска"/>
     <w:p>
       <w:pPr>
         <w:pStyle w:val="Heading1"/>
       </w:pPr>
       <w:r>
-        <w:t xml:space="preserve">6. Run order</w:t>
+        <w:t xml:space="preserve">6. Порядок запуска</w:t>
       </w:r>
     </w:p>
     <w:p>
@@ -1702,7 +1696,22 @@
         <w:pStyle w:val="FirstParagraph"/>
       </w:pPr>
       <w:r>
-        <w:t xml:space="preserve">Run all scripts from the</w:t>
+        <w:t xml:space="preserve">Все скрипты запускаются через</w:t>
+      </w:r>
+      <w:r>
+        <w:t xml:space="preserve"> </w:t>
+      </w:r>
+      <w:r>
+        <w:rPr>
+          <w:rStyle w:val="VerbatimChar"/>
+        </w:rPr>
+        <w:t xml:space="preserve">psql</w:t>
+      </w:r>
+      <w:r>
+        <w:t xml:space="preserve"> </w:t>
+      </w:r>
+      <w:r>
+        <w:t xml:space="preserve">из папки</w:t>
       </w:r>
       <w:r>
         <w:t xml:space="preserve"> </w:t>
@@ -1714,22 +1723,7 @@
         <w:t xml:space="preserve">sql</w:t>
       </w:r>
       <w:r>
-        <w:t xml:space="preserve"> </w:t>
-      </w:r>
-      <w:r>
-        <w:t xml:space="preserve">folder with</w:t>
-      </w:r>
-      <w:r>
-        <w:t xml:space="preserve"> </w:t>
-      </w:r>
-      <w:r>
-        <w:rPr>
-          <w:rStyle w:val="VerbatimChar"/>
-        </w:rPr>
-        <w:t xml:space="preserve">psql</w:t>
-      </w:r>
-      <w:r>
-        <w:t xml:space="preserve">. Replace the connection options with your own.</w:t>
+        <w:t xml:space="preserve">, иначе загрузчик не найдёт CSV-файлы.</w:t>
       </w:r>
     </w:p>
     <w:tbl>
@@ -1756,31 +1750,31 @@
               <w:jc w:val="left"/>
             </w:pPr>
             <w:r>
-              <w:t xml:space="preserve">Step</w:t>
-            </w:r>
-          </w:p>
-        </w:tc>
-        <w:tc>
-          <w:tcPr/>
-          <w:p>
-            <w:pPr>
-              <w:pStyle w:val="Compact"/>
-              <w:jc w:val="left"/>
-            </w:pPr>
-            <w:r>
-              <w:t xml:space="preserve">Command</w:t>
-            </w:r>
-          </w:p>
-        </w:tc>
-        <w:tc>
-          <w:tcPr/>
-          <w:p>
-            <w:pPr>
-              <w:pStyle w:val="Compact"/>
-              <w:jc w:val="left"/>
-            </w:pPr>
-            <w:r>
-              <w:t xml:space="preserve">Result</w:t>
+              <w:t xml:space="preserve">Шаг</w:t>
+            </w:r>
+          </w:p>
+        </w:tc>
+        <w:tc>
+          <w:tcPr/>
+          <w:p>
+            <w:pPr>
+              <w:pStyle w:val="Compact"/>
+              <w:jc w:val="left"/>
+            </w:pPr>
+            <w:r>
+              <w:t xml:space="preserve">Команда</w:t>
+            </w:r>
+          </w:p>
+        </w:tc>
+        <w:tc>
+          <w:tcPr/>
+          <w:p>
+            <w:pPr>
+              <w:pStyle w:val="Compact"/>
+              <w:jc w:val="left"/>
+            </w:pPr>
+            <w:r>
+              <w:t xml:space="preserve">Результат</w:t>
             </w:r>
           </w:p>
         </w:tc>
@@ -1821,7 +1815,7 @@
               <w:jc w:val="left"/>
             </w:pPr>
             <w:r>
-              <w:t xml:space="preserve">Creates both databases</w:t>
+              <w:t xml:space="preserve">Создаёт обе базы</w:t>
             </w:r>
           </w:p>
         </w:tc>
@@ -1862,7 +1856,7 @@
               <w:jc w:val="left"/>
             </w:pPr>
             <w:r>
-              <w:t xml:space="preserve">OLTP tables</w:t>
+              <w:t xml:space="preserve">Таблицы OLTP</w:t>
             </w:r>
           </w:p>
         </w:tc>
@@ -1903,7 +1897,7 @@
               <w:jc w:val="left"/>
             </w:pPr>
             <w:r>
-              <w:t xml:space="preserve">Loads the CSV files (rerunnable)</w:t>
+              <w:t xml:space="preserve">Загрузка CSV (можно перезапускать)</w:t>
             </w:r>
           </w:p>
         </w:tc>
@@ -1944,7 +1938,7 @@
               <w:jc w:val="left"/>
             </w:pPr>
             <w:r>
-              <w:t xml:space="preserve">DWH tables</w:t>
+              <w:t xml:space="preserve">Таблицы хранилища</w:t>
             </w:r>
           </w:p>
         </w:tc>
@@ -1973,19 +1967,19 @@
               <w:rPr>
                 <w:rStyle w:val="VerbatimChar"/>
               </w:rPr>
-              <w:t xml:space="preserve">psql -U postgres -f 04_etl_oltp_to_olap.sql</w:t>
-            </w:r>
-          </w:p>
-        </w:tc>
-        <w:tc>
-          <w:tcPr/>
-          <w:p>
-            <w:pPr>
-              <w:pStyle w:val="Compact"/>
-              <w:jc w:val="left"/>
-            </w:pPr>
-            <w:r>
-              <w:t xml:space="preserve">ETL (rerunnable)</w:t>
+              <w:t xml:space="preserve">psql -U postgres -v oltp_password=ПАРОЛЬ -f 04_etl_oltp_to_olap.sql</w:t>
+            </w:r>
+          </w:p>
+        </w:tc>
+        <w:tc>
+          <w:tcPr/>
+          <w:p>
+            <w:pPr>
+              <w:pStyle w:val="Compact"/>
+              <w:jc w:val="left"/>
+            </w:pPr>
+            <w:r>
+              <w:t xml:space="preserve">ETL (можно перезапускать)</w:t>
             </w:r>
           </w:p>
         </w:tc>
@@ -2026,7 +2020,7 @@
               <w:jc w:val="left"/>
             </w:pPr>
             <w:r>
-              <w:t xml:space="preserve">5 OLTP queries</w:t>
+              <w:t xml:space="preserve">5 запросов к OLTP</w:t>
             </w:r>
           </w:p>
         </w:tc>
@@ -2067,7 +2061,7 @@
               <w:jc w:val="left"/>
             </w:pPr>
             <w:r>
-              <w:t xml:space="preserve">6 OLAP queries</w:t>
+              <w:t xml:space="preserve">6 запросов к OLAP</w:t>
             </w:r>
           </w:p>
         </w:tc>
@@ -2096,19 +2090,19 @@
               <w:rPr>
                 <w:rStyle w:val="VerbatimChar"/>
               </w:rPr>
-              <w:t xml:space="preserve">psql -U postgres -f 07_demo_scd2.sql</w:t>
-            </w:r>
-          </w:p>
-        </w:tc>
-        <w:tc>
-          <w:tcPr/>
-          <w:p>
-            <w:pPr>
-              <w:pStyle w:val="Compact"/>
-              <w:jc w:val="left"/>
-            </w:pPr>
-            <w:r>
-              <w:t xml:space="preserve">Price change demo for the defense</w:t>
+              <w:t xml:space="preserve">psql -U postgres -v oltp_password=ПАРОЛЬ -f 07_demo_scd2.sql</w:t>
+            </w:r>
+          </w:p>
+        </w:tc>
+        <w:tc>
+          <w:tcPr/>
+          <w:p>
+            <w:pPr>
+              <w:pStyle w:val="Compact"/>
+              <w:jc w:val="left"/>
+            </w:pPr>
+            <w:r>
+              <w:t xml:space="preserve">Демонстрация смены цены для защиты</w:t>
             </w:r>
           </w:p>
         </w:tc>
@@ -2119,22 +2113,73 @@
         <w:pStyle w:val="BodyText"/>
       </w:pPr>
       <w:r>
-        <w:t xml:space="preserve">If the OLTP database is on another host, pass</w:t>
-      </w:r>
-      <w:r>
-        <w:t xml:space="preserve"> </w:t>
-      </w:r>
-      <w:r>
-        <w:rPr>
-          <w:rStyle w:val="VerbatimChar"/>
-        </w:rPr>
-        <w:t xml:space="preserve">-v oltp_host=... -v oltp_port=... -v oltp_user=... -v oltp_password=...</w:t>
-      </w:r>
-      <w:r>
-        <w:t xml:space="preserve"> </w:t>
-      </w:r>
-      <w:r>
-        <w:t xml:space="preserve">to steps 5 and 8.</w:t>
+        <w:t xml:space="preserve">Шаги 5 и 8 подключаются к OLTP-базе через</w:t>
+      </w:r>
+      <w:r>
+        <w:t xml:space="preserve"> </w:t>
+      </w:r>
+      <w:r>
+        <w:rPr>
+          <w:rStyle w:val="VerbatimChar"/>
+        </w:rPr>
+        <w:t xml:space="preserve">postgres_fdw</w:t>
+      </w:r>
+      <w:r>
+        <w:t xml:space="preserve">, поэтому им нужен пароль пользователя</w:t>
+      </w:r>
+      <w:r>
+        <w:t xml:space="preserve"> </w:t>
+      </w:r>
+      <w:r>
+        <w:rPr>
+          <w:rStyle w:val="VerbatimChar"/>
+        </w:rPr>
+        <w:t xml:space="preserve">postgres</w:t>
+      </w:r>
+      <w:r>
+        <w:t xml:space="preserve"> </w:t>
+      </w:r>
+      <w:r>
+        <w:t xml:space="preserve">в параметре</w:t>
+      </w:r>
+      <w:r>
+        <w:t xml:space="preserve"> </w:t>
+      </w:r>
+      <w:r>
+        <w:rPr>
+          <w:rStyle w:val="VerbatimChar"/>
+        </w:rPr>
+        <w:t xml:space="preserve">oltp_password</w:t>
+      </w:r>
+      <w:r>
+        <w:t xml:space="preserve">. Если OLTP-база стоит на другом сервере, добавьте</w:t>
+      </w:r>
+      <w:r>
+        <w:t xml:space="preserve"> </w:t>
+      </w:r>
+      <w:r>
+        <w:rPr>
+          <w:rStyle w:val="VerbatimChar"/>
+        </w:rPr>
+        <w:t xml:space="preserve">-v oltp_host=... -v oltp_port=... -v oltp_user=...</w:t>
+      </w:r>
+      <w:r>
+        <w:t xml:space="preserve">. Параметр</w:t>
+      </w:r>
+      <w:r>
+        <w:t xml:space="preserve"> </w:t>
+      </w:r>
+      <w:r>
+        <w:rPr>
+          <w:rStyle w:val="VerbatimChar"/>
+        </w:rPr>
+        <w:t xml:space="preserve">-v ON_ERROR_STOP=1</w:t>
+      </w:r>
+      <w:r>
+        <w:t xml:space="preserve"> </w:t>
+      </w:r>
+      <w:r>
+        <w:t xml:space="preserve">останавливает скрипт на первой ошибке.</w:t>
       </w:r>
       <w:r>
         <w:t xml:space="preserve"> </w:t>
@@ -2149,17 +2194,17 @@
         <w:t xml:space="preserve"> </w:t>
       </w:r>
       <w:r>
-        <w:t xml:space="preserve">drops both databases.</w:t>
+        <w:t xml:space="preserve">удаляет обе базы.</w:t>
       </w:r>
     </w:p>
     <w:bookmarkEnd w:id="31"/>
-    <w:bookmarkStart w:id="32" w:name="queries"/>
+    <w:bookmarkStart w:id="32" w:name="запросы"/>
     <w:p>
       <w:pPr>
         <w:pStyle w:val="Heading1"/>
       </w:pPr>
       <w:r>
-        <w:t xml:space="preserve">7. Queries</w:t>
+        <w:t xml:space="preserve">7. Запросы</w:t>
       </w:r>
     </w:p>
     <w:p>
@@ -2167,17 +2212,17 @@
         <w:pStyle w:val="FirstParagraph"/>
       </w:pPr>
       <w:r>
-        <w:t xml:space="preserve">Each OLTP and OLAP script answers questions over the same data, so results can be compared. OLTP query 4 and OLAP query 1 both compute revenue by genre. The totals match to the cent (2,953.24 net revenue in both databases). OLAP query 3 lists every price version of every game with the units and revenue sold at that price.</w:t>
+        <w:t xml:space="preserve">Скрипты для OLTP и OLAP отвечают на вопросы по одним и тем же данным, поэтому результаты можно сравнить. Запрос 4 к OLTP и запрос 1 к OLAP считают выручку по жанрам. Итоги совпадают до цента: 2 953,24 чистой выручки в обеих базах. Запрос 3 к OLAP выводит каждую версию цены каждой игры с числом продаж и выручкой по этой цене.</w:t>
       </w:r>
     </w:p>
     <w:bookmarkEnd w:id="32"/>
-    <w:bookmarkStart w:id="36" w:name="power-bi-report"/>
+    <w:bookmarkStart w:id="36" w:name="отчёт-power-bi"/>
     <w:p>
       <w:pPr>
         <w:pStyle w:val="Heading1"/>
       </w:pPr>
       <w:r>
-        <w:t xml:space="preserve">8. Power BI report</w:t>
+        <w:t xml:space="preserve">8. Отчёт Power BI</w:t>
       </w:r>
     </w:p>
     <w:p>
@@ -2185,7 +2230,7 @@
         <w:pStyle w:val="FirstParagraph"/>
       </w:pPr>
       <w:r>
-        <w:t xml:space="preserve">The report</w:t>
+        <w:t xml:space="preserve">Отчёт</w:t>
       </w:r>
       <w:r>
         <w:t xml:space="preserve"> </w:t>
@@ -2200,7 +2245,7 @@
         <w:t xml:space="preserve"> </w:t>
       </w:r>
       <w:r>
-        <w:t xml:space="preserve">connects to</w:t>
+        <w:t xml:space="preserve">подключается к</w:t>
       </w:r>
       <w:r>
         <w:t xml:space="preserve"> </w:t>
@@ -2215,7 +2260,7 @@
         <w:t xml:space="preserve"> </w:t>
       </w:r>
       <w:r>
-        <w:t xml:space="preserve">in Import mode and loads ten tables of schema</w:t>
+        <w:t xml:space="preserve">в режиме импорта и загружает десять таблиц схемы</w:t>
       </w:r>
       <w:r>
         <w:t xml:space="preserve"> </w:t>
@@ -2227,7 +2272,7 @@
         <w:t xml:space="preserve">steam_dwh</w:t>
       </w:r>
       <w:r>
-        <w:t xml:space="preserve">: two facts, the bridge and seven dimensions.</w:t>
+        <w:t xml:space="preserve">: два факта, bridge-таблицу и семь измерений.</w:t>
       </w:r>
       <w:r>
         <w:t xml:space="preserve"> </w:t>
@@ -2242,7 +2287,7 @@
         <w:t xml:space="preserve"> </w:t>
       </w:r>
       <w:r>
-        <w:t xml:space="preserve">and the staging schema stay out of the model. Build steps and the DAX code are in</w:t>
+        <w:t xml:space="preserve">и staging-схема в модель не входят. Шаги сборки и код DAX описаны в</w:t>
       </w:r>
       <w:r>
         <w:t xml:space="preserve"> </w:t>
@@ -2266,7 +2311,7 @@
           <wp:inline>
             <wp:extent cx="5334000" cy="3235472"/>
             <wp:effectExtent b="0" l="0" r="0" t="0"/>
-            <wp:docPr descr="Power BI page Sales Overview" title="" id="34" name="Picture"/>
+            <wp:docPr descr="Страница Power BI Sales Overview" title="" id="34" name="Picture"/>
             <a:graphic>
               <a:graphicData uri="http://schemas.openxmlformats.org/drawingml/2006/picture">
                 <pic:pic>
@@ -2309,7 +2354,7 @@
         <w:pStyle w:val="ImageCaption"/>
       </w:pPr>
       <w:r>
-        <w:t xml:space="preserve">Power BI page Sales Overview</w:t>
+        <w:t xml:space="preserve">Страница Power BI Sales Overview</w:t>
       </w:r>
     </w:p>
     <w:p>
@@ -2321,7 +2366,7 @@
           <w:bCs/>
           <w:b/>
         </w:rPr>
-        <w:t xml:space="preserve">Transformations in Power Query</w:t>
+        <w:t xml:space="preserve">Преобразования в Power Query</w:t>
       </w:r>
     </w:p>
     <w:p>
@@ -2366,7 +2411,7 @@
         <w:t xml:space="preserve"> </w:t>
       </w:r>
       <w:r>
-        <w:t xml:space="preserve">and</w:t>
+        <w:t xml:space="preserve">и</w:t>
       </w:r>
       <w:r>
         <w:t xml:space="preserve"> </w:t>
@@ -2381,7 +2426,7 @@
         <w:t xml:space="preserve"> </w:t>
       </w:r>
       <w:r>
-        <w:t xml:space="preserve">changed to fixed decimal number,</w:t>
+        <w:t xml:space="preserve">переведены в фиксированное десятичное число,</w:t>
       </w:r>
       <w:r>
         <w:t xml:space="preserve"> </w:t>
@@ -2396,7 +2441,7 @@
         <w:t xml:space="preserve"> </w:t>
       </w:r>
       <w:r>
-        <w:t xml:space="preserve">to whole number.</w:t>
+        <w:t xml:space="preserve">в целое.</w:t>
       </w:r>
     </w:p>
     <w:p>
@@ -2429,7 +2474,7 @@
         <w:t xml:space="preserve"> </w:t>
       </w:r>
       <w:r>
-        <w:t xml:space="preserve">changed to uppercase.</w:t>
+        <w:t xml:space="preserve">переведён в верхний регистр.</w:t>
       </w:r>
     </w:p>
     <w:p>
@@ -2447,7 +2492,7 @@
         <w:t xml:space="preserve">dim_date</w:t>
       </w:r>
       <w:r>
-        <w:t xml:space="preserve">: rows filtered to years 2025 and 2026,</w:t>
+        <w:t xml:space="preserve">: оставлены строки за 2025 и 2026 годы,</w:t>
       </w:r>
       <w:r>
         <w:t xml:space="preserve"> </w:t>
@@ -2462,7 +2507,7 @@
         <w:t xml:space="preserve"> </w:t>
       </w:r>
       <w:r>
-        <w:t xml:space="preserve">typed as Date.</w:t>
+        <w:t xml:space="preserve">получил тип «Дата».</w:t>
       </w:r>
     </w:p>
     <w:p>
@@ -2495,7 +2540,7 @@
         <w:t xml:space="preserve"> </w:t>
       </w:r>
       <w:r>
-        <w:t xml:space="preserve">and</w:t>
+        <w:t xml:space="preserve">и</w:t>
       </w:r>
       <w:r>
         <w:t xml:space="preserve"> </w:t>
@@ -2510,7 +2555,7 @@
         <w:t xml:space="preserve"> </w:t>
       </w:r>
       <w:r>
-        <w:t xml:space="preserve">typed as Date.</w:t>
+        <w:t xml:space="preserve">получили тип «Дата».</w:t>
       </w:r>
     </w:p>
     <w:p>
@@ -2522,7 +2567,7 @@
         <w:pStyle w:val="Compact"/>
       </w:pPr>
       <w:r>
-        <w:t xml:space="preserve">Tables renamed without the schema prefix,</w:t>
+        <w:t xml:space="preserve">Таблицы переименованы без префикса схемы,</w:t>
       </w:r>
       <w:r>
         <w:t xml:space="preserve"> </w:t>
@@ -2537,7 +2582,7 @@
         <w:t xml:space="preserve"> </w:t>
       </w:r>
       <w:r>
-        <w:t xml:space="preserve">sorted by</w:t>
+        <w:t xml:space="preserve">отсортирован по</w:t>
       </w:r>
       <w:r>
         <w:t xml:space="preserve"> </w:t>
@@ -2561,7 +2606,7 @@
           <w:bCs/>
           <w:b/>
         </w:rPr>
-        <w:t xml:space="preserve">Model</w:t>
+        <w:t xml:space="preserve">Модель</w:t>
       </w:r>
     </w:p>
     <w:p>
@@ -2569,7 +2614,7 @@
         <w:pStyle w:val="BodyText"/>
       </w:pPr>
       <w:r>
-        <w:t xml:space="preserve">Relationships run many-to-one from the facts to the dimensions, with single-direction filters.</w:t>
+        <w:t xml:space="preserve">Связи идут от фактов к измерениям по схеме «многие к одному», фильтр работает в одном направлении.</w:t>
       </w:r>
       <w:r>
         <w:t xml:space="preserve"> </w:t>
@@ -2584,7 +2629,7 @@
         <w:t xml:space="preserve"> </w:t>
       </w:r>
       <w:r>
-        <w:t xml:space="preserve">points to</w:t>
+        <w:t xml:space="preserve">ссылается на</w:t>
       </w:r>
       <w:r>
         <w:t xml:space="preserve"> </w:t>
@@ -2596,7 +2641,7 @@
         <w:t xml:space="preserve">dim_country</w:t>
       </w:r>
       <w:r>
-        <w:t xml:space="preserve">, so the country slicer filters both facts. The relationship from</w:t>
+        <w:t xml:space="preserve">, поэтому срез по стране фильтрует оба факта. Связь</w:t>
       </w:r>
       <w:r>
         <w:t xml:space="preserve"> </w:t>
@@ -2611,7 +2656,7 @@
         <w:t xml:space="preserve"> </w:t>
       </w:r>
       <w:r>
-        <w:t xml:space="preserve">to</w:t>
+        <w:t xml:space="preserve">с</w:t>
       </w:r>
       <w:r>
         <w:t xml:space="preserve"> </w:t>
@@ -2626,7 +2671,7 @@
         <w:t xml:space="preserve"> </w:t>
       </w:r>
       <w:r>
-        <w:t xml:space="preserve">stays inactive, because an active one would open a second path from</w:t>
+        <w:t xml:space="preserve">оставлена неактивной: активная связь открыла бы второй путь от</w:t>
       </w:r>
       <w:r>
         <w:t xml:space="preserve"> </w:t>
@@ -2641,7 +2686,7 @@
         <w:t xml:space="preserve"> </w:t>
       </w:r>
       <w:r>
-        <w:t xml:space="preserve">to</w:t>
+        <w:t xml:space="preserve">к</w:t>
       </w:r>
       <w:r>
         <w:t xml:space="preserve"> </w:t>
@@ -2653,7 +2698,7 @@
         <w:t xml:space="preserve">fact_sales</w:t>
       </w:r>
       <w:r>
-        <w:t xml:space="preserve">. The measure Current Price switches it on with</w:t>
+        <w:t xml:space="preserve">. Мера Current Price включает её через</w:t>
       </w:r>
       <w:r>
         <w:t xml:space="preserve"> </w:t>
@@ -2677,7 +2722,7 @@
           <w:bCs/>
           <w:b/>
         </w:rPr>
-        <w:t xml:space="preserve">Measures</w:t>
+        <w:t xml:space="preserve">Меры</w:t>
       </w:r>
     </w:p>
     <w:p>
@@ -2689,7 +2734,7 @@
         <w:pStyle w:val="Compact"/>
       </w:pPr>
       <w:r>
-        <w:t xml:space="preserve">Net Revenue, Gross Revenue, Units Sold: sums over</w:t>
+        <w:t xml:space="preserve">Net Revenue, Gross Revenue, Units Sold: суммы по</w:t>
       </w:r>
       <w:r>
         <w:t xml:space="preserve"> </w:t>
@@ -2713,7 +2758,7 @@
         <w:pStyle w:val="Compact"/>
       </w:pPr>
       <w:r>
-        <w:t xml:space="preserve">Discount Share: discount amount divided by gross revenue.</w:t>
+        <w:t xml:space="preserve">Discount Share: сумма скидок, делённая на валовую выручку.</w:t>
       </w:r>
     </w:p>
     <w:p>
@@ -2725,7 +2770,7 @@
         <w:pStyle w:val="Compact"/>
       </w:pPr>
       <w:r>
-        <w:t xml:space="preserve">Avg Rating: average review rating weighted by the number of reviews.</w:t>
+        <w:t xml:space="preserve">Avg Rating: средняя оценка, взвешенная по числу отзывов.</w:t>
       </w:r>
     </w:p>
     <w:p>
@@ -2737,7 +2782,7 @@
         <w:pStyle w:val="Compact"/>
       </w:pPr>
       <w:r>
-        <w:t xml:space="preserve">Current Price: price of the SCD Type 2 version with</w:t>
+        <w:t xml:space="preserve">Current Price: цена версии SCD Type 2 с</w:t>
       </w:r>
       <w:r>
         <w:t xml:space="preserve"> </w:t>
@@ -2761,7 +2806,7 @@
         <w:pStyle w:val="Compact"/>
       </w:pPr>
       <w:r>
-        <w:t xml:space="preserve">Allocated Revenue by Genre: net revenue of each game multiplied by its bridge weight, so genre values add up to total revenue.</w:t>
+        <w:t xml:space="preserve">Allocated Revenue by Genre: чистая выручка каждой игры, умноженная на её вес в bridge-таблице. Выручка по жанрам в сумме равна общей.</w:t>
       </w:r>
     </w:p>
     <w:p>
@@ -2773,7 +2818,7 @@
           <w:bCs/>
           <w:b/>
         </w:rPr>
-        <w:t xml:space="preserve">Page layout</w:t>
+        <w:t xml:space="preserve">Страница отчёта</w:t>
       </w:r>
     </w:p>
     <w:tbl>
@@ -2800,31 +2845,31 @@
               <w:jc w:val="left"/>
             </w:pPr>
             <w:r>
-              <w:t xml:space="preserve">Element</w:t>
-            </w:r>
-          </w:p>
-        </w:tc>
-        <w:tc>
-          <w:tcPr/>
-          <w:p>
-            <w:pPr>
-              <w:pStyle w:val="Compact"/>
-              <w:jc w:val="left"/>
-            </w:pPr>
-            <w:r>
-              <w:t xml:space="preserve">Fields</w:t>
-            </w:r>
-          </w:p>
-        </w:tc>
-        <w:tc>
-          <w:tcPr/>
-          <w:p>
-            <w:pPr>
-              <w:pStyle w:val="Compact"/>
-              <w:jc w:val="left"/>
-            </w:pPr>
-            <w:r>
-              <w:t xml:space="preserve">Question it answers</w:t>
+              <w:t xml:space="preserve">Элемент</w:t>
+            </w:r>
+          </w:p>
+        </w:tc>
+        <w:tc>
+          <w:tcPr/>
+          <w:p>
+            <w:pPr>
+              <w:pStyle w:val="Compact"/>
+              <w:jc w:val="left"/>
+            </w:pPr>
+            <w:r>
+              <w:t xml:space="preserve">Поля</w:t>
+            </w:r>
+          </w:p>
+        </w:tc>
+        <w:tc>
+          <w:tcPr/>
+          <w:p>
+            <w:pPr>
+              <w:pStyle w:val="Compact"/>
+              <w:jc w:val="left"/>
+            </w:pPr>
+            <w:r>
+              <w:t xml:space="preserve">На какой вопрос отвечает</w:t>
             </w:r>
           </w:p>
         </w:tc>
@@ -2838,7 +2883,7 @@
               <w:jc w:val="left"/>
             </w:pPr>
             <w:r>
-              <w:t xml:space="preserve">Title</w:t>
+              <w:t xml:space="preserve">Заголовок</w:t>
             </w:r>
           </w:p>
         </w:tc>
@@ -2872,7 +2917,7 @@
               <w:jc w:val="left"/>
             </w:pPr>
             <w:r>
-              <w:t xml:space="preserve">Three cards</w:t>
+              <w:t xml:space="preserve">Три карточки</w:t>
             </w:r>
           </w:p>
         </w:tc>
@@ -2896,7 +2941,7 @@
               <w:jc w:val="left"/>
             </w:pPr>
             <w:r>
-              <w:t xml:space="preserve">What are the totals for the selected period and country?</w:t>
+              <w:t xml:space="preserve">Какие итоги за выбранный период и страну?</w:t>
             </w:r>
           </w:p>
         </w:tc>
@@ -2910,7 +2955,7 @@
               <w:jc w:val="left"/>
             </w:pPr>
             <w:r>
-              <w:t xml:space="preserve">Slicer (dropdown)</w:t>
+              <w:t xml:space="preserve">Срез (раскрывающийся список)</w:t>
             </w:r>
           </w:p>
         </w:tc>
@@ -2949,7 +2994,7 @@
               <w:jc w:val="left"/>
             </w:pPr>
             <w:r>
-              <w:t xml:space="preserve">Narrows every visual to a year or month</w:t>
+              <w:t xml:space="preserve">Сужает все визуалы до года или месяца</w:t>
             </w:r>
           </w:p>
         </w:tc>
@@ -2963,7 +3008,7 @@
               <w:jc w:val="left"/>
             </w:pPr>
             <w:r>
-              <w:t xml:space="preserve">Slicer (list)</w:t>
+              <w:t xml:space="preserve">Срез (список)</w:t>
             </w:r>
           </w:p>
         </w:tc>
@@ -2990,7 +3035,7 @@
               <w:jc w:val="left"/>
             </w:pPr>
             <w:r>
-              <w:t xml:space="preserve">Narrows every visual to one or more countries</w:t>
+              <w:t xml:space="preserve">Сужает все визуалы до одной или нескольких стран</w:t>
             </w:r>
           </w:p>
         </w:tc>
@@ -3004,7 +3049,7 @@
               <w:jc w:val="left"/>
             </w:pPr>
             <w:r>
-              <w:t xml:space="preserve">Line chart</w:t>
+              <w:t xml:space="preserve">Линейный график</w:t>
             </w:r>
           </w:p>
         </w:tc>
@@ -3034,7 +3079,7 @@
               <w:jc w:val="left"/>
             </w:pPr>
             <w:r>
-              <w:t xml:space="preserve">Which months earned the most?</w:t>
+              <w:t xml:space="preserve">Какие месяцы принесли больше всего выручки?</w:t>
             </w:r>
           </w:p>
         </w:tc>
@@ -3048,7 +3093,7 @@
               <w:jc w:val="left"/>
             </w:pPr>
             <w:r>
-              <w:t xml:space="preserve">Bar chart</w:t>
+              <w:t xml:space="preserve">Линейчатая диаграмма</w:t>
             </w:r>
           </w:p>
         </w:tc>
@@ -3078,7 +3123,7 @@
               <w:jc w:val="left"/>
             </w:pPr>
             <w:r>
-              <w:t xml:space="preserve">Which games bring the most revenue?</w:t>
+              <w:t xml:space="preserve">Какие игры приносят больше всего выручки?</w:t>
             </w:r>
           </w:p>
         </w:tc>
@@ -3092,7 +3137,7 @@
               <w:jc w:val="left"/>
             </w:pPr>
             <w:r>
-              <w:t xml:space="preserve">Pie chart</w:t>
+              <w:t xml:space="preserve">Круговая диаграмма</w:t>
             </w:r>
           </w:p>
         </w:tc>
@@ -3122,7 +3167,7 @@
               <w:jc w:val="left"/>
             </w:pPr>
             <w:r>
-              <w:t xml:space="preserve">Which genres bring the most revenue?</w:t>
+              <w:t xml:space="preserve">Какие жанры приносят больше всего выручки?</w:t>
             </w:r>
           </w:p>
         </w:tc>
@@ -3136,7 +3181,7 @@
               <w:jc w:val="left"/>
             </w:pPr>
             <w:r>
-              <w:t xml:space="preserve">Table</w:t>
+              <w:t xml:space="preserve">Таблица</w:t>
             </w:r>
           </w:p>
         </w:tc>
@@ -3166,7 +3211,7 @@
               <w:jc w:val="left"/>
             </w:pPr>
             <w:r>
-              <w:t xml:space="preserve">How does the current price compare with past sales?</w:t>
+              <w:t xml:space="preserve">Как текущая цена соотносится с прошлыми продажами?</w:t>
             </w:r>
           </w:p>
         </w:tc>
@@ -3181,7 +3226,7 @@
           <w:bCs/>
           <w:b/>
         </w:rPr>
-        <w:t xml:space="preserve">Findings with no slicer selected</w:t>
+        <w:t xml:space="preserve">Выводы без выбранных срезов</w:t>
       </w:r>
     </w:p>
     <w:p>
@@ -3193,7 +3238,7 @@
         <w:pStyle w:val="Compact"/>
       </w:pPr>
       <w:r>
-        <w:t xml:space="preserve">Net revenue is EUR 2,953.24 from 165 purchases. Both numbers match the SQL control totals of the ETL.</w:t>
+        <w:t xml:space="preserve">Чистая выручка составляет 2 953,24 EUR за 165 покупок. Обе цифры совпадают с контрольными суммами ETL.</w:t>
       </w:r>
     </w:p>
     <w:p>
@@ -3205,7 +3250,7 @@
         <w:pStyle w:val="Compact"/>
       </w:pPr>
       <w:r>
-        <w:t xml:space="preserve">Sales run from May 2025 to May 2026. May 2026 is the best month with EUR 506.97, November 2025 the second with EUR 437.33.</w:t>
+        <w:t xml:space="preserve">Продажи идут с мая 2025 по май 2026 года. Лучший месяц: май 2026 (506,97 EUR), второй: ноябрь 2025 (437,33 EUR).</w:t>
       </w:r>
     </w:p>
     <w:p>
@@ -3217,7 +3262,7 @@
         <w:pStyle w:val="Compact"/>
       </w:pPr>
       <w:r>
-        <w:t xml:space="preserve">Baldur’s Gate 3 earns the most (EUR 739.68). Portal 2 sells the most copies (25).</w:t>
+        <w:t xml:space="preserve">Больше всего зарабатывает Baldur’s Gate 3 (739,68 EUR). Больше всего копий продаёт Portal 2 (25).</w:t>
       </w:r>
     </w:p>
     <w:p>
@@ -3229,7 +3274,7 @@
         <w:pStyle w:val="Compact"/>
       </w:pPr>
       <w:r>
-        <w:t xml:space="preserve">Adventure leads the genres with EUR 888.55 (30.09%), RPG follows with EUR 475.42.</w:t>
+        <w:t xml:space="preserve">Среди жанров лидирует Adventure: 888,55 EUR (30,09%). На втором месте RPG с 475,42 EUR.</w:t>
       </w:r>
     </w:p>
     <w:p>
@@ -3241,7 +3286,7 @@
         <w:pStyle w:val="Compact"/>
       </w:pPr>
       <w:r>
-        <w:t xml:space="preserve">Counter-Strike 2 and Dota 2 account for 31 purchases at EUR 0: free games added to a library.</w:t>
+        <w:t xml:space="preserve">На Counter-Strike 2 и Dota 2 приходится 31 покупка на 0 EUR: так платформа записывает добавление бесплатной игры в библиотеку.</w:t>
       </w:r>
     </w:p>
     <w:p>
@@ -3253,17 +3298,17 @@
         <w:pStyle w:val="Compact"/>
       </w:pPr>
       <w:r>
-        <w:t xml:space="preserve">The average review rating is 3.01 out of 5.</w:t>
+        <w:t xml:space="preserve">Средняя оценка в отзывах: 3,01 из 5.</w:t>
       </w:r>
     </w:p>
     <w:bookmarkEnd w:id="36"/>
-    <w:bookmarkStart w:id="37" w:name="defense-notes"/>
+    <w:bookmarkStart w:id="37" w:name="тезисы-для-защиты"/>
     <w:p>
       <w:pPr>
         <w:pStyle w:val="Heading1"/>
       </w:pPr>
       <w:r>
-        <w:t xml:space="preserve">9. Defense notes</w:t>
+        <w:t xml:space="preserve">9. Тезисы для защиты</w:t>
       </w:r>
     </w:p>
     <w:p>
@@ -3275,7 +3320,7 @@
         <w:pStyle w:val="Compact"/>
       </w:pPr>
       <w:r>
-        <w:t xml:space="preserve">OLTP has 13 tables in 3NF. CSV files have no surrogate keys and number five.</w:t>
+        <w:t xml:space="preserve">OLTP состоит из 13 таблиц в 3НФ. CSV-файлов пять, суррогатных ключей в них нет.</w:t>
       </w:r>
     </w:p>
     <w:p>
@@ -3287,7 +3332,7 @@
         <w:pStyle w:val="Compact"/>
       </w:pPr>
       <w:r>
-        <w:t xml:space="preserve">Load and ETL scripts do not modify rows whose values did not change. A test run of both scripts left every row version in both databases identical.</w:t>
+        <w:t xml:space="preserve">Скрипты загрузки и ETL не меняют строки, значения которых не изменились. Повторный прогон обоих скриптов оставил версии всех строк в обеих базах прежними.</w:t>
       </w:r>
     </w:p>
     <w:p>
@@ -3299,7 +3344,7 @@
         <w:pStyle w:val="Compact"/>
       </w:pPr>
       <w:r>
-        <w:t xml:space="preserve">OLAP is a separate database, a snowflake with two facts, one SCD Type 2 and one bridge. One fact is an aggregation of three OLTP tables.</w:t>
+        <w:t xml:space="preserve">OLAP лежит в отдельной базе: snowflake с двумя фактами, одной SCD Type 2 и одной bridge-таблицей. Один из фактов агрегирует три таблицы OLTP.</w:t>
       </w:r>
     </w:p>
     <w:p>
@@ -3311,7 +3356,7 @@
         <w:pStyle w:val="Compact"/>
       </w:pPr>
       <w:r>
-        <w:t xml:space="preserve">The SCD demo (</w:t>
+        <w:t xml:space="preserve">Демонстрация SCD (</w:t>
       </w:r>
       <w:r>
         <w:rPr>
@@ -3320,7 +3365,7 @@
         <w:t xml:space="preserve">07_demo_scd2.sql</w:t>
       </w:r>
       <w:r>
-        <w:t xml:space="preserve">) changes the price of Hades in OLTP. The ETL closes the version valid until 2026-06-30 and adds a current version at 19.99.</w:t>
+        <w:t xml:space="preserve">) меняет цену Hades в OLTP. ETL закрывает версию, действовавшую до 2026-06-30, и добавляет текущую версию по цене 19,99.</w:t>
       </w:r>
     </w:p>
     <w:p>
@@ -3332,7 +3377,7 @@
         <w:pStyle w:val="Compact"/>
       </w:pPr>
       <w:r>
-        <w:t xml:space="preserve">The ETL validates data and keeps refused records with a reason in</w:t>
+        <w:t xml:space="preserve">ETL проверяет данные и сохраняет отклонённые записи с причиной в</w:t>
       </w:r>
       <w:r>
         <w:t xml:space="preserve"> </w:t>
@@ -3701,7 +3746,7 @@
         <w:rFonts w:asciiTheme="minorHAnsi" w:cstheme="minorBidi" w:eastAsiaTheme="minorHAnsi" w:hAnsiTheme="minorHAnsi"/>
         <w:sz w:val="24"/>
         <w:szCs w:val="24"/>
-        <w:lang w:bidi="ar-SA" w:eastAsia="en-US" w:val="en-US"/>
+        <w:lang w:bidi="ar-SA" w:eastAsia="en-US" w:val="ru-RU"/>
       </w:rPr>
     </w:rPrDefault>
     <w:pPrDefault>

</xml_diff>

<commit_message>
Remove defense notes from report
</commit_message>
<xml_diff>
--- a/steam_coursework_project/docs/CourseWork_Report_SteamLike.docx
+++ b/steam_coursework_project/docs/CourseWork_Report_SteamLike.docx
@@ -3302,97 +3302,6 @@
       </w:r>
     </w:p>
     <w:bookmarkEnd w:id="36"/>
-    <w:bookmarkStart w:id="37" w:name="тезисы-для-защиты"/>
-    <w:p>
-      <w:pPr>
-        <w:pStyle w:val="Heading1"/>
-      </w:pPr>
-      <w:r>
-        <w:t xml:space="preserve">9. Тезисы для защиты</w:t>
-      </w:r>
-    </w:p>
-    <w:p>
-      <w:pPr>
-        <w:numPr>
-          <w:ilvl w:val="0"/>
-          <w:numId w:val="1006"/>
-        </w:numPr>
-        <w:pStyle w:val="Compact"/>
-      </w:pPr>
-      <w:r>
-        <w:t xml:space="preserve">OLTP состоит из 13 таблиц в 3НФ. CSV-файлов пять, суррогатных ключей в них нет.</w:t>
-      </w:r>
-    </w:p>
-    <w:p>
-      <w:pPr>
-        <w:numPr>
-          <w:ilvl w:val="0"/>
-          <w:numId w:val="1006"/>
-        </w:numPr>
-        <w:pStyle w:val="Compact"/>
-      </w:pPr>
-      <w:r>
-        <w:t xml:space="preserve">Скрипты загрузки и ETL не меняют строки, значения которых не изменились. Повторный прогон обоих скриптов оставил версии всех строк в обеих базах прежними.</w:t>
-      </w:r>
-    </w:p>
-    <w:p>
-      <w:pPr>
-        <w:numPr>
-          <w:ilvl w:val="0"/>
-          <w:numId w:val="1006"/>
-        </w:numPr>
-        <w:pStyle w:val="Compact"/>
-      </w:pPr>
-      <w:r>
-        <w:t xml:space="preserve">OLAP лежит в отдельной базе: snowflake с двумя фактами, одной SCD Type 2 и одной bridge-таблицей. Один из фактов агрегирует три таблицы OLTP.</w:t>
-      </w:r>
-    </w:p>
-    <w:p>
-      <w:pPr>
-        <w:numPr>
-          <w:ilvl w:val="0"/>
-          <w:numId w:val="1006"/>
-        </w:numPr>
-        <w:pStyle w:val="Compact"/>
-      </w:pPr>
-      <w:r>
-        <w:t xml:space="preserve">Демонстрация SCD (</w:t>
-      </w:r>
-      <w:r>
-        <w:rPr>
-          <w:rStyle w:val="VerbatimChar"/>
-        </w:rPr>
-        <w:t xml:space="preserve">07_demo_scd2.sql</w:t>
-      </w:r>
-      <w:r>
-        <w:t xml:space="preserve">) меняет цену Hades в OLTP. ETL закрывает версию, действовавшую до 2026-06-30, и добавляет текущую версию по цене 19,99.</w:t>
-      </w:r>
-    </w:p>
-    <w:p>
-      <w:pPr>
-        <w:numPr>
-          <w:ilvl w:val="0"/>
-          <w:numId w:val="1006"/>
-        </w:numPr>
-        <w:pStyle w:val="Compact"/>
-      </w:pPr>
-      <w:r>
-        <w:t xml:space="preserve">ETL проверяет данные и сохраняет отклонённые записи с причиной в</w:t>
-      </w:r>
-      <w:r>
-        <w:t xml:space="preserve"> </w:t>
-      </w:r>
-      <w:r>
-        <w:rPr>
-          <w:rStyle w:val="VerbatimChar"/>
-        </w:rPr>
-        <w:t xml:space="preserve">etl_rejects</w:t>
-      </w:r>
-      <w:r>
-        <w:t xml:space="preserve">.</w:t>
-      </w:r>
-    </w:p>
-    <w:bookmarkEnd w:id="37"/>
     <w:sectPr/>
   </w:body>
 </w:document>
@@ -3730,9 +3639,6 @@
     <w:abstractNumId w:val="991"/>
   </w:num>
   <w:num w:numId="1005">
-    <w:abstractNumId w:val="991"/>
-  </w:num>
-  <w:num w:numId="1006">
     <w:abstractNumId w:val="991"/>
   </w:num>
 </w:numbering>

</xml_diff>